<commit_message>
Update Naturalle Home media plan: Shopify, B2B-only reps, showroom, site verification
Co-Authored-By: Claude Sonnet 5.5 <noreply@anthropic.com>
Claude-Session: https://claude.ai/code/session_01L7FPnELCKKchZCPLwgEHRi
</commit_message>
<xml_diff>
--- a/naturalle-home/Plano-Midia-Naturalle-Home.docx
+++ b/naturalle-home/Plano-Midia-Naturalle-Home.docx
@@ -88,7 +88,7 @@
           <w:iCs/>
           <w:i/>
         </w:rPr>
-        <w:t xml:space="preserve">Base: Relatório de Anúncios Meta/Instagram dos últimos 90 dias (24/06 a 21/09/2026, Meta Business Suite), calendário de conteúdo e confirmações do Cicero (site já no ar; conta de anúncios e pixel no portfólio Sultan). Os dados de público e de custo de mídia são reais. Não existem ainda dados de vendas online, ticket, margem ou conversão do site: todo resultado de venda (ROAS, pedidos, conversão) é hipótese de planejamento, não garantia. Os dados de público descrevem engajamento e audiência, não compradores.</w:t>
+        <w:t xml:space="preserve">Base: Relatório de Anúncios Meta/Instagram dos últimos 90 dias (24/06 a 21/09/2026, Meta Business Suite), calendário de conteúdo e confirmações do Cicero (site já no ar em Shopify; conta de anúncios e pixel no portfólio Sultan; representantes vendem só B2B) e verificação do site naturallehome.com.br em 08/10/2026. Os dados de público e de custo de mídia são reais. Não existem ainda dados de vendas online, ticket, margem ou conversão do site: todo resultado de venda (ROAS, pedidos, conversão) é hipótese de planejamento, não garantia. Os dados de público descrevem engajamento e audiência, não compradores.</w:t>
       </w:r>
     </w:p>
     <w:bookmarkStart w:id="20" w:name="o-que-está-definido"/>
@@ -135,13 +135,57 @@
           <w:bCs/>
           <w:b/>
         </w:rPr>
-        <w:t xml:space="preserve">Site já está no ar.</w:t>
-      </w:r>
-      <w:r>
-        <w:t xml:space="preserve"> </w:t>
-      </w:r>
-      <w:r>
-        <w:t xml:space="preserve">A mídia pode medir vendas assim que pixel, GA4 e conversões estiverem funcionando.</w:t>
+        <w:t xml:space="preserve">Site já está no ar, em Shopify</w:t>
+      </w:r>
+      <w:r>
+        <w:t xml:space="preserve"> </w:t>
+      </w:r>
+      <w:r>
+        <w:t xml:space="preserve">(loja sultan-naturalle.myshopify.com). A mídia pode medir vendas assim que pixel, GA4 e conversões estiverem funcionando.</w:t>
+      </w:r>
+    </w:p>
+    <w:p>
+      <w:pPr>
+        <w:numPr>
+          <w:ilvl w:val="0"/>
+          <w:numId w:val="1001"/>
+        </w:numPr>
+        <w:pStyle w:val="Compact"/>
+      </w:pPr>
+      <w:r>
+        <w:rPr>
+          <w:bCs/>
+          <w:b/>
+        </w:rPr>
+        <w:t xml:space="preserve">Representantes vendem só B2B.</w:t>
+      </w:r>
+      <w:r>
+        <w:t xml:space="preserve"> </w:t>
+      </w:r>
+      <w:r>
+        <w:t xml:space="preserve">O consumidor final compra apenas pelo site, pelo WhatsApp ou pelo showroom.</w:t>
+      </w:r>
+    </w:p>
+    <w:p>
+      <w:pPr>
+        <w:numPr>
+          <w:ilvl w:val="0"/>
+          <w:numId w:val="1001"/>
+        </w:numPr>
+        <w:pStyle w:val="Compact"/>
+      </w:pPr>
+      <w:r>
+        <w:rPr>
+          <w:bCs/>
+          <w:b/>
+        </w:rPr>
+        <w:t xml:space="preserve">Showroom em São Paulo, só com agendamento</w:t>
+      </w:r>
+      <w:r>
+        <w:t xml:space="preserve"> </w:t>
+      </w:r>
+      <w:r>
+        <w:t xml:space="preserve">(página "Agendar Visita" do site). Vira uma conversão da mídia na região de São Paulo.</w:t>
       </w:r>
     </w:p>
     <w:p>
@@ -650,6 +694,106 @@
           </w:p>
         </w:tc>
       </w:tr>
+      <w:tr>
+        <w:tc>
+          <w:tcPr/>
+          <w:p>
+            <w:pPr>
+              <w:pStyle w:val="Compact"/>
+              <w:jc w:val="left"/>
+            </w:pPr>
+            <w:r>
+              <w:rPr>
+                <w:rFonts w:ascii="Arial" w:hAnsi="Arial"/>
+                <w:sz w:val="17"/>
+              </w:rPr>
+              <w:t xml:space="preserve">Site (verificado em 08/10/2026)</w:t>
+            </w:r>
+          </w:p>
+        </w:tc>
+        <w:tc>
+          <w:tcPr/>
+          <w:p>
+            <w:pPr>
+              <w:pStyle w:val="Compact"/>
+              <w:jc w:val="left"/>
+            </w:pPr>
+            <w:r>
+              <w:rPr>
+                <w:rFonts w:ascii="Arial" w:hAnsi="Arial"/>
+                <w:sz w:val="17"/>
+              </w:rPr>
+              <w:t xml:space="preserve">Shopify. Showroom em São Paulo (Edifício Panamerica, R. Bela Cintra, 772, 2º andar, Consolação), segunda a sexta, 9h às 18h, só com agendamento pelo formulário; visita de 45 a 60 minutos com consultor dedicado. Klaviyo (e-mail marketing) instalado. Troca: a primeira postagem é por conta da Naturalle; arrependimento em até 7 dias corridos. Página "Onde Encontrar" sem lojas listadas. O link "WhatsApp" do rodapé apareceu sem endereço (o botão flutuante funciona)</w:t>
+            </w:r>
+          </w:p>
+        </w:tc>
+        <w:tc>
+          <w:tcPr/>
+          <w:p>
+            <w:pPr>
+              <w:pStyle w:val="Compact"/>
+              <w:jc w:val="left"/>
+            </w:pPr>
+            <w:r>
+              <w:rPr>
+                <w:rFonts w:ascii="Arial" w:hAnsi="Arial"/>
+                <w:sz w:val="17"/>
+              </w:rPr>
+              <w:t xml:space="preserve">Showroom e consultoria são diferenciais de venda; corrigir o link do rodapé; não prometer "troca grátis" além do que a política diz</w:t>
+            </w:r>
+          </w:p>
+        </w:tc>
+      </w:tr>
+      <w:tr>
+        <w:tc>
+          <w:tcPr/>
+          <w:p>
+            <w:pPr>
+              <w:pStyle w:val="Compact"/>
+              <w:jc w:val="left"/>
+            </w:pPr>
+            <w:r>
+              <w:rPr>
+                <w:rFonts w:ascii="Arial" w:hAnsi="Arial"/>
+                <w:sz w:val="17"/>
+              </w:rPr>
+              <w:t xml:space="preserve">Rastreamento no site</w:t>
+            </w:r>
+          </w:p>
+        </w:tc>
+        <w:tc>
+          <w:tcPr/>
+          <w:p>
+            <w:pPr>
+              <w:pStyle w:val="Compact"/>
+              <w:jc w:val="left"/>
+            </w:pPr>
+            <w:r>
+              <w:rPr>
+                <w:rFonts w:ascii="Arial" w:hAnsi="Arial"/>
+                <w:sz w:val="17"/>
+              </w:rPr>
+              <w:t xml:space="preserve">Na página inicial não aparecem scripts diretos de pixel do Meta nem de GA4 ou Google Tag Manager. O Shopify carrega pixels por apps (7 pixels de apps detectados), e não deu para identificar de qual app cada um é</w:t>
+            </w:r>
+          </w:p>
+        </w:tc>
+        <w:tc>
+          <w:tcPr/>
+          <w:p>
+            <w:pPr>
+              <w:pStyle w:val="Compact"/>
+              <w:jc w:val="left"/>
+            </w:pPr>
+            <w:r>
+              <w:rPr>
+                <w:rFonts w:ascii="Arial" w:hAnsi="Arial"/>
+                <w:sz w:val="17"/>
+              </w:rPr>
+              <w:t xml:space="preserve">Não dá para confirmar pelo lado de fora. Verificar no Shopify (Eventos do cliente e apps de canais de venda)</w:t>
+            </w:r>
+          </w:p>
+        </w:tc>
+      </w:tr>
     </w:tbl>
     <w:bookmarkEnd w:id="22"/>
     <w:bookmarkStart w:id="31" w:name="Xe573a5b3b960ba85b3f4da35f89dc63d5b0800a"/>
@@ -675,7 +819,7 @@
         <w:pStyle w:val="FirstParagraph"/>
       </w:pPr>
       <w:r>
-        <w:t xml:space="preserve">Construir a Naturalle Home como marca premium de cama, mesa e banho para o consumidor final (B2C), com vendas lucrativas e recorrentes, sem conflitar com o canal dos representantes. Com o site no ar, o foco passa a ser medir e converter, sem perder a construção de marca.</w:t>
+        <w:t xml:space="preserve">Construir a Naturalle Home como marca premium de cama, mesa e banho para o consumidor final (B2C), com vendas lucrativas e recorrentes, sem conflitar com o canal B2B (representantes e lojistas). Com o site no ar, o foco passa a ser medir e converter, sem perder a construção de marca.</w:t>
       </w:r>
     </w:p>
     <w:bookmarkEnd w:id="23"/>
@@ -707,7 +851,7 @@
         <w:t xml:space="preserve"> </w:t>
       </w:r>
       <w:r>
-        <w:t xml:space="preserve">catálogo profundo por tecido (Supima 1000/600/400, Percal 200, Cetim 300), peças artesanais, coleções, showroom, WhatsApp consultivo, 71,6 mil seguidores de alto padrão, orgânico editorial e sem desconto, engajamento que dobrou, CPM competitivo, site no ar.</w:t>
+        <w:t xml:space="preserve">catálogo profundo por tecido (Supima 1000/600/400, Percal 200, Cetim 300), peças artesanais, coleções, showroom em São Paulo com consultor dedicado, WhatsApp consultivo, Klaviyo já instalado, 71,6 mil seguidores de alto padrão, orgânico editorial e sem desconto, engajamento que dobrou, CPM competitivo, site no ar.</w:t>
       </w:r>
     </w:p>
     <w:p>
@@ -1134,6 +1278,56 @@
                 <w:rFonts w:ascii="Arial" w:hAnsi="Arial"/>
                 <w:sz w:val="17"/>
               </w:rPr>
+              <w:t xml:space="preserve">Ocasiões (hipótese, a partir da página do showroom)</w:t>
+            </w:r>
+          </w:p>
+        </w:tc>
+        <w:tc>
+          <w:tcPr/>
+          <w:p>
+            <w:pPr>
+              <w:pStyle w:val="Compact"/>
+              <w:jc w:val="left"/>
+            </w:pPr>
+            <w:r>
+              <w:rPr>
+                <w:rFonts w:ascii="Arial" w:hAnsi="Arial"/>
+                <w:sz w:val="17"/>
+              </w:rPr>
+              <w:t xml:space="preserve">A página do showroom cita clientes finais com compras de maior volume, como enxoval de casamento e reforma</w:t>
+            </w:r>
+          </w:p>
+        </w:tc>
+        <w:tc>
+          <w:tcPr/>
+          <w:p>
+            <w:pPr>
+              <w:pStyle w:val="Compact"/>
+              <w:jc w:val="left"/>
+            </w:pPr>
+            <w:r>
+              <w:rPr>
+                <w:rFonts w:ascii="Arial" w:hAnsi="Arial"/>
+                <w:sz w:val="17"/>
+              </w:rPr>
+              <w:t xml:space="preserve">Testar criativos de enxoval de casamento, presente de casamento e reforma, além do quarto</w:t>
+            </w:r>
+          </w:p>
+        </w:tc>
+      </w:tr>
+      <w:tr>
+        <w:tc>
+          <w:tcPr/>
+          <w:p>
+            <w:pPr>
+              <w:pStyle w:val="Compact"/>
+              <w:jc w:val="left"/>
+            </w:pPr>
+            <w:r>
+              <w:rPr>
+                <w:rFonts w:ascii="Arial" w:hAnsi="Arial"/>
+                <w:sz w:val="17"/>
+              </w:rPr>
               <w:t xml:space="preserve">Perfil de compra</w:t>
             </w:r>
           </w:p>
@@ -1409,7 +1603,7 @@
         <w:t xml:space="preserve"> </w:t>
       </w:r>
       <w:r>
-        <w:t xml:space="preserve">manter o padrão sem desconto do orgânico. Se houver oferta de entrada, uma só e discreta (por exemplo, 10% na primeira compra, como faz a Trussardi), sem virar hábito. O site hoje oferece 5% no Pix, 10x sem juros e frete grátis acima de R$ 1.000: tratar como facilitadores, não como argumento principal.</w:t>
+        <w:t xml:space="preserve">manter o padrão sem desconto do orgânico. Se houver oferta de entrada, uma só e discreta (por exemplo, 10% na primeira compra, como faz a Trussardi), sem virar hábito. O site hoje oferece 5% no Pix, 10x sem juros e frete grátis acima de R$ 1.000: tratar como facilitadores, não como argumento principal. Definir com a área B2B uma regra de preço público mínimo, para que o site não concorra com os lojistas.</w:t>
       </w:r>
     </w:p>
     <w:bookmarkEnd w:id="26"/>
@@ -1847,13 +2041,13 @@
           <w:bCs/>
           <w:b/>
         </w:rPr>
-        <w:t xml:space="preserve">Conflito de canal com os representantes</w:t>
-      </w:r>
-      <w:r>
-        <w:t xml:space="preserve"> </w:t>
-      </w:r>
-      <w:r>
-        <w:t xml:space="preserve">(preço e condições online x offline).</w:t>
+        <w:t xml:space="preserve">Conflito de preço entre o varejo online e os lojistas B2B:</w:t>
+      </w:r>
+      <w:r>
+        <w:t xml:space="preserve"> </w:t>
+      </w:r>
+      <w:r>
+        <w:t xml:space="preserve">os representantes vendem só B2B, mas lojistas anunciam ao consumidor final. Definir regra de preço público.</w:t>
       </w:r>
     </w:p>
     <w:p>
@@ -1869,7 +2063,13 @@
           <w:bCs/>
           <w:b/>
         </w:rPr>
-        <w:t xml:space="preserve">Ticket alto sem prova social.</w:t>
+        <w:t xml:space="preserve">Capacidade do showroom:</w:t>
+      </w:r>
+      <w:r>
+        <w:t xml:space="preserve"> </w:t>
+      </w:r>
+      <w:r>
+        <w:t xml:space="preserve">atendimento só com agendamento e consultor dedicado (45 a 60 minutos). Anunciar a visita sem limitar a agenda pode gerar fila e frustração.</w:t>
       </w:r>
     </w:p>
     <w:p>
@@ -1885,13 +2085,7 @@
           <w:bCs/>
           <w:b/>
         </w:rPr>
-        <w:t xml:space="preserve">Desconto por pressão de data comercial</w:t>
-      </w:r>
-      <w:r>
-        <w:t xml:space="preserve"> </w:t>
-      </w:r>
-      <w:r>
-        <w:t xml:space="preserve">(Black Friday) corroendo o posicionamento premium.</w:t>
+        <w:t xml:space="preserve">Ticket alto sem prova social.</w:t>
       </w:r>
     </w:p>
     <w:p>
@@ -1907,7 +2101,13 @@
           <w:bCs/>
           <w:b/>
         </w:rPr>
-        <w:t xml:space="preserve">Dados de audiência não são dados de compradores.</w:t>
+        <w:t xml:space="preserve">Desconto por pressão de data comercial</w:t>
+      </w:r>
+      <w:r>
+        <w:t xml:space="preserve"> </w:t>
+      </w:r>
+      <w:r>
+        <w:t xml:space="preserve">(Black Friday) corroendo o posicionamento premium.</w:t>
       </w:r>
     </w:p>
     <w:p>
@@ -1923,13 +2123,7 @@
           <w:bCs/>
           <w:b/>
         </w:rPr>
-        <w:t xml:space="preserve">Estrutura no portfólio Sultan:</w:t>
-      </w:r>
-      <w:r>
-        <w:t xml:space="preserve"> </w:t>
-      </w:r>
-      <w:r>
-        <w:t xml:space="preserve">o domínio naturallehome.com.br precisa estar verificado no Business Manager da Sultan e o pixel precisa ficar nele, com permissões corretas.</w:t>
+        <w:t xml:space="preserve">Dados de audiência não são dados de compradores.</w:t>
       </w:r>
     </w:p>
     <w:p>
@@ -1945,6 +2139,28 @@
           <w:bCs/>
           <w:b/>
         </w:rPr>
+        <w:t xml:space="preserve">Estrutura no portfólio Sultan:</w:t>
+      </w:r>
+      <w:r>
+        <w:t xml:space="preserve"> </w:t>
+      </w:r>
+      <w:r>
+        <w:t xml:space="preserve">o domínio naturallehome.com.br precisa estar verificado no Business Manager da Sultan e o pixel precisa ficar nele, com permissões corretas.</w:t>
+      </w:r>
+    </w:p>
+    <w:p>
+      <w:pPr>
+        <w:numPr>
+          <w:ilvl w:val="0"/>
+          <w:numId w:val="1007"/>
+        </w:numPr>
+        <w:pStyle w:val="Compact"/>
+      </w:pPr>
+      <w:r>
+        <w:rPr>
+          <w:bCs/>
+          <w:b/>
+        </w:rPr>
         <w:t xml:space="preserve">Uso de bases de clientes</w:t>
       </w:r>
       <w:r>
@@ -1974,7 +2190,7 @@
     </w:p>
     <w:bookmarkEnd w:id="30"/>
     <w:bookmarkEnd w:id="31"/>
-    <w:bookmarkStart w:id="40" w:name="tático-como-horizonte-cerca-de-90-dias"/>
+    <w:bookmarkStart w:id="41" w:name="tático-como-horizonte-cerca-de-90-dias"/>
     <w:p>
       <w:pPr>
         <w:pStyle w:val="Heading1"/>
@@ -2815,7 +3031,7 @@
                 <w:rFonts w:ascii="Arial" w:hAnsi="Arial"/>
                 <w:sz w:val="17"/>
               </w:rPr>
-              <w:t xml:space="preserve">Conversa no WhatsApp</w:t>
+              <w:t xml:space="preserve">Conversa no WhatsApp e agendamento de visita ao showroom (região de São Paulo)</w:t>
             </w:r>
           </w:p>
         </w:tc>
@@ -2982,7 +3198,83 @@
       </w:r>
     </w:p>
     <w:bookmarkEnd w:id="33"/>
-    <w:bookmarkStart w:id="34" w:name="segmentação-com-os-dados-reais"/>
+    <w:bookmarkStart w:id="34" w:name="showroom-como-conversão-são-paulo"/>
+    <w:p>
+      <w:pPr>
+        <w:pStyle w:val="Heading2"/>
+      </w:pPr>
+      <w:r>
+        <w:t xml:space="preserve">Showroom como conversão (São Paulo)</w:t>
+      </w:r>
+    </w:p>
+    <w:p>
+      <w:pPr>
+        <w:numPr>
+          <w:ilvl w:val="0"/>
+          <w:numId w:val="1008"/>
+        </w:numPr>
+        <w:pStyle w:val="Compact"/>
+      </w:pPr>
+      <w:r>
+        <w:rPr>
+          <w:bCs/>
+          <w:b/>
+        </w:rPr>
+        <w:t xml:space="preserve">Evento:</w:t>
+      </w:r>
+      <w:r>
+        <w:t xml:space="preserve"> </w:t>
+      </w:r>
+      <w:r>
+        <w:t xml:space="preserve">envio do formulário "Agendar Visita" como conversão própria (Lead), medida no Meta e no Google.</w:t>
+      </w:r>
+    </w:p>
+    <w:p>
+      <w:pPr>
+        <w:numPr>
+          <w:ilvl w:val="0"/>
+          <w:numId w:val="1008"/>
+        </w:numPr>
+        <w:pStyle w:val="Compact"/>
+      </w:pPr>
+      <w:r>
+        <w:rPr>
+          <w:bCs/>
+          <w:b/>
+        </w:rPr>
+        <w:t xml:space="preserve">Público:</w:t>
+      </w:r>
+      <w:r>
+        <w:t xml:space="preserve"> </w:t>
+      </w:r>
+      <w:r>
+        <w:t xml:space="preserve">região de São Paulo (cidade e entorno), mulheres 35+, com criativo de "toque e compare os tecidos com um consultor". São Paulo é o maior estado do engajamento (24,4%) e a maior cidade da audiência (27,6%).</w:t>
+      </w:r>
+    </w:p>
+    <w:p>
+      <w:pPr>
+        <w:numPr>
+          <w:ilvl w:val="0"/>
+          <w:numId w:val="1008"/>
+        </w:numPr>
+        <w:pStyle w:val="Compact"/>
+      </w:pPr>
+      <w:r>
+        <w:rPr>
+          <w:bCs/>
+          <w:b/>
+        </w:rPr>
+        <w:t xml:space="preserve">Limite:</w:t>
+      </w:r>
+      <w:r>
+        <w:t xml:space="preserve"> </w:t>
+      </w:r>
+      <w:r>
+        <w:t xml:space="preserve">alinhar a capacidade de agenda com o showroom antes de aumentar a verba desta campanha. A página também é aberta a lojistas, arquitetos e designers: a landing da campanha deve ser a de cliente final.</w:t>
+      </w:r>
+    </w:p>
+    <w:bookmarkEnd w:id="34"/>
+    <w:bookmarkStart w:id="35" w:name="segmentação-com-os-dados-reais"/>
     <w:p>
       <w:pPr>
         <w:pStyle w:val="Heading2"/>
@@ -3300,7 +3592,7 @@
       <w:pPr>
         <w:numPr>
           <w:ilvl w:val="0"/>
-          <w:numId w:val="1008"/>
+          <w:numId w:val="1009"/>
         </w:numPr>
         <w:pStyle w:val="Compact"/>
       </w:pPr>
@@ -3316,104 +3608,6 @@
       </w:r>
       <w:r>
         <w:t xml:space="preserve">mulheres de 35 anos ou mais, sem teto de idade, começando amplo (sem fatiar por faixa). A leitura por faixa etária é feita no relatório de resultados.</w:t>
-      </w:r>
-    </w:p>
-    <w:p>
-      <w:pPr>
-        <w:numPr>
-          <w:ilvl w:val="0"/>
-          <w:numId w:val="1008"/>
-        </w:numPr>
-        <w:pStyle w:val="Compact"/>
-      </w:pPr>
-      <w:r>
-        <w:rPr>
-          <w:bCs/>
-          <w:b/>
-        </w:rPr>
-        <w:t xml:space="preserve">Frequência:</w:t>
-      </w:r>
-      <w:r>
-        <w:t xml:space="preserve"> </w:t>
-      </w:r>
-      <w:r>
-        <w:t xml:space="preserve">limite de 3 a 4 impressões por semana nas campanhas de alcance.</w:t>
-      </w:r>
-    </w:p>
-    <w:p>
-      <w:pPr>
-        <w:numPr>
-          <w:ilvl w:val="0"/>
-          <w:numId w:val="1008"/>
-        </w:numPr>
-        <w:pStyle w:val="Compact"/>
-      </w:pPr>
-      <w:r>
-        <w:rPr>
-          <w:bCs/>
-          <w:b/>
-        </w:rPr>
-        <w:t xml:space="preserve">Google:</w:t>
-      </w:r>
-      <w:r>
-        <w:t xml:space="preserve"> </w:t>
-      </w:r>
-      <w:r>
-        <w:t xml:space="preserve">palavras-chave exatas e de frase (jogo de cama 1000 fios, lençol Supima, enxoval de luxo, edredom de luxo, marca) nos mesmos estados. Negativar: barato, atacado, grátis, usado, como fazer. Idade e gênero como observação, não restrição.</w:t>
-      </w:r>
-    </w:p>
-    <w:p>
-      <w:pPr>
-        <w:numPr>
-          <w:ilvl w:val="0"/>
-          <w:numId w:val="1008"/>
-        </w:numPr>
-        <w:pStyle w:val="Compact"/>
-      </w:pPr>
-      <w:r>
-        <w:rPr>
-          <w:bCs/>
-          <w:b/>
-        </w:rPr>
-        <w:t xml:space="preserve">Criativos:</w:t>
-      </w:r>
-      <w:r>
-        <w:t xml:space="preserve"> </w:t>
-      </w:r>
-      <w:r>
-        <w:t xml:space="preserve">Reels novos, verticais, sem preço ou desconto, no padrão editorial do orgânico; testar pelo menos 3 conceitos em paralelo; partir de Vichy A e Tartan (melhor custo), em versões novas, porque o criativo atual passou de 100 dias no ar. Explorar Stories dedicados (hoje 4,5% da entrega).</w:t>
-      </w:r>
-    </w:p>
-    <w:p>
-      <w:pPr>
-        <w:numPr>
-          <w:ilvl w:val="0"/>
-          <w:numId w:val="1008"/>
-        </w:numPr>
-        <w:pStyle w:val="Compact"/>
-      </w:pPr>
-      <w:r>
-        <w:rPr>
-          <w:bCs/>
-          <w:b/>
-        </w:rPr>
-        <w:t xml:space="preserve">Rodar 14 a 21 dias sem mexer</w:t>
-      </w:r>
-      <w:r>
-        <w:t xml:space="preserve"> </w:t>
-      </w:r>
-      <w:r>
-        <w:t xml:space="preserve">depois de cada mudança grande de estrutura na Etapa 1; 7 dias nas demais.</w:t>
-      </w:r>
-    </w:p>
-    <w:bookmarkEnd w:id="34"/>
-    <w:bookmarkStart w:id="35" w:name="calendário-comercial"/>
-    <w:p>
-      <w:pPr>
-        <w:pStyle w:val="Heading2"/>
-      </w:pPr>
-      <w:r>
-        <w:t xml:space="preserve">Calendário comercial</w:t>
       </w:r>
     </w:p>
     <w:p>
@@ -3429,13 +3623,13 @@
           <w:bCs/>
           <w:b/>
         </w:rPr>
-        <w:t xml:space="preserve">Black Friday (27/11/2026) e Natal:</w:t>
-      </w:r>
-      <w:r>
-        <w:t xml:space="preserve"> </w:t>
-      </w:r>
-      <w:r>
-        <w:t xml:space="preserve">tratar como período de aprendizado, sem desconto agressivo; foco em presente (brinde, embalagem, atendimento ou frete em vez de percentual: hipótese a testar).</w:t>
+        <w:t xml:space="preserve">Frequência:</w:t>
+      </w:r>
+      <w:r>
+        <w:t xml:space="preserve"> </w:t>
+      </w:r>
+      <w:r>
+        <w:t xml:space="preserve">limite de 3 a 4 impressões por semana nas campanhas de alcance.</w:t>
       </w:r>
     </w:p>
     <w:p>
@@ -3451,6 +3645,104 @@
           <w:bCs/>
           <w:b/>
         </w:rPr>
+        <w:t xml:space="preserve">Google:</w:t>
+      </w:r>
+      <w:r>
+        <w:t xml:space="preserve"> </w:t>
+      </w:r>
+      <w:r>
+        <w:t xml:space="preserve">palavras-chave exatas e de frase (jogo de cama 1000 fios, lençol Supima, enxoval de luxo, edredom de luxo, marca) nos mesmos estados. Negativar: barato, atacado, grátis, usado, como fazer. Idade e gênero como observação, não restrição.</w:t>
+      </w:r>
+    </w:p>
+    <w:p>
+      <w:pPr>
+        <w:numPr>
+          <w:ilvl w:val="0"/>
+          <w:numId w:val="1009"/>
+        </w:numPr>
+        <w:pStyle w:val="Compact"/>
+      </w:pPr>
+      <w:r>
+        <w:rPr>
+          <w:bCs/>
+          <w:b/>
+        </w:rPr>
+        <w:t xml:space="preserve">Criativos:</w:t>
+      </w:r>
+      <w:r>
+        <w:t xml:space="preserve"> </w:t>
+      </w:r>
+      <w:r>
+        <w:t xml:space="preserve">Reels novos, verticais, sem preço ou desconto, no padrão editorial do orgânico; testar pelo menos 3 conceitos em paralelo; partir de Vichy A e Tartan (melhor custo), em versões novas, porque o criativo atual passou de 100 dias no ar. Explorar Stories dedicados (hoje 4,5% da entrega).</w:t>
+      </w:r>
+    </w:p>
+    <w:p>
+      <w:pPr>
+        <w:numPr>
+          <w:ilvl w:val="0"/>
+          <w:numId w:val="1009"/>
+        </w:numPr>
+        <w:pStyle w:val="Compact"/>
+      </w:pPr>
+      <w:r>
+        <w:rPr>
+          <w:bCs/>
+          <w:b/>
+        </w:rPr>
+        <w:t xml:space="preserve">Rodar 14 a 21 dias sem mexer</w:t>
+      </w:r>
+      <w:r>
+        <w:t xml:space="preserve"> </w:t>
+      </w:r>
+      <w:r>
+        <w:t xml:space="preserve">depois de cada mudança grande de estrutura na Etapa 1; 7 dias nas demais.</w:t>
+      </w:r>
+    </w:p>
+    <w:bookmarkEnd w:id="35"/>
+    <w:bookmarkStart w:id="36" w:name="calendário-comercial"/>
+    <w:p>
+      <w:pPr>
+        <w:pStyle w:val="Heading2"/>
+      </w:pPr>
+      <w:r>
+        <w:t xml:space="preserve">Calendário comercial</w:t>
+      </w:r>
+    </w:p>
+    <w:p>
+      <w:pPr>
+        <w:numPr>
+          <w:ilvl w:val="0"/>
+          <w:numId w:val="1010"/>
+        </w:numPr>
+        <w:pStyle w:val="Compact"/>
+      </w:pPr>
+      <w:r>
+        <w:rPr>
+          <w:bCs/>
+          <w:b/>
+        </w:rPr>
+        <w:t xml:space="preserve">Black Friday (27/11/2026) e Natal:</w:t>
+      </w:r>
+      <w:r>
+        <w:t xml:space="preserve"> </w:t>
+      </w:r>
+      <w:r>
+        <w:t xml:space="preserve">tratar como período de aprendizado, sem desconto agressivo; foco em presente (brinde, embalagem, atendimento ou frete em vez de percentual: hipótese a testar).</w:t>
+      </w:r>
+    </w:p>
+    <w:p>
+      <w:pPr>
+        <w:numPr>
+          <w:ilvl w:val="0"/>
+          <w:numId w:val="1010"/>
+        </w:numPr>
+        <w:pStyle w:val="Compact"/>
+      </w:pPr>
+      <w:r>
+        <w:rPr>
+          <w:bCs/>
+          <w:b/>
+        </w:rPr>
         <w:t xml:space="preserve">Dia das Mães (09/05/2027):</w:t>
       </w:r>
       <w:r>
@@ -3460,8 +3752,8 @@
         <w:t xml:space="preserve">principal pico do ciclo. Campanha de presente a partir de março, com kits prontos, prazo de entrega claro e criativos de presentear bem.</w:t>
       </w:r>
     </w:p>
-    <w:bookmarkEnd w:id="35"/>
-    <w:bookmarkStart w:id="36" w:name="X887540ad64271fe394e9f82eb9c67d24fbe8897"/>
+    <w:bookmarkEnd w:id="36"/>
+    <w:bookmarkStart w:id="37" w:name="X887540ad64271fe394e9f82eb9c67d24fbe8897"/>
     <w:p>
       <w:pPr>
         <w:pStyle w:val="Heading2"/>
@@ -3787,176 +4079,14 @@
         <w:t xml:space="preserve">Com margem de 40% (equilíbrio 2,5), só o cenário base e o otimista pagam a mídia. Referência real: com o CPM de R$ 18,04, R$ 3.200 por mês no Meta compram cerca de 177 mil impressões; a taxa de clique para o site ainda é desconhecida e será o primeiro dado a medir.</w:t>
       </w:r>
     </w:p>
-    <w:bookmarkEnd w:id="36"/>
-    <w:bookmarkStart w:id="37" w:name="mix-de-marketing-e-funil-4-ps-funil"/>
+    <w:bookmarkEnd w:id="37"/>
+    <w:bookmarkStart w:id="38" w:name="mix-de-marketing-e-funil-4-ps-funil"/>
     <w:p>
       <w:pPr>
         <w:pStyle w:val="Heading2"/>
       </w:pPr>
       <w:r>
         <w:t xml:space="preserve">Mix de marketing e funil (4 Ps, Funil)</w:t>
-      </w:r>
-    </w:p>
-    <w:p>
-      <w:pPr>
-        <w:numPr>
-          <w:ilvl w:val="0"/>
-          <w:numId w:val="1010"/>
-        </w:numPr>
-        <w:pStyle w:val="Compact"/>
-      </w:pPr>
-      <w:r>
-        <w:rPr>
-          <w:bCs/>
-          <w:b/>
-        </w:rPr>
-        <w:t xml:space="preserve">Produto:</w:t>
-      </w:r>
-      <w:r>
-        <w:t xml:space="preserve"> </w:t>
-      </w:r>
-      <w:r>
-        <w:t xml:space="preserve">kits curados por perfil (calor, frio, presente).</w:t>
-      </w:r>
-      <w:r>
-        <w:t xml:space="preserve"> </w:t>
-      </w:r>
-      <w:r>
-        <w:rPr>
-          <w:bCs/>
-          <w:b/>
-        </w:rPr>
-        <w:t xml:space="preserve">Preço:</w:t>
-      </w:r>
-      <w:r>
-        <w:t xml:space="preserve"> </w:t>
-      </w:r>
-      <w:r>
-        <w:t xml:space="preserve">premium, sem desconto como argumento.</w:t>
-      </w:r>
-      <w:r>
-        <w:t xml:space="preserve"> </w:t>
-      </w:r>
-      <w:r>
-        <w:rPr>
-          <w:bCs/>
-          <w:b/>
-        </w:rPr>
-        <w:t xml:space="preserve">Praça:</w:t>
-      </w:r>
-      <w:r>
-        <w:t xml:space="preserve"> </w:t>
-      </w:r>
-      <w:r>
-        <w:t xml:space="preserve">site, WhatsApp, showroom.</w:t>
-      </w:r>
-      <w:r>
-        <w:t xml:space="preserve"> </w:t>
-      </w:r>
-      <w:r>
-        <w:rPr>
-          <w:bCs/>
-          <w:b/>
-        </w:rPr>
-        <w:t xml:space="preserve">Promoção:</w:t>
-      </w:r>
-      <w:r>
-        <w:t xml:space="preserve"> </w:t>
-      </w:r>
-      <w:r>
-        <w:t xml:space="preserve">Instagram e TikTok orgânicos, parcerias de design e mídia paga.</w:t>
-      </w:r>
-    </w:p>
-    <w:p>
-      <w:pPr>
-        <w:numPr>
-          <w:ilvl w:val="0"/>
-          <w:numId w:val="1010"/>
-        </w:numPr>
-        <w:pStyle w:val="Compact"/>
-      </w:pPr>
-      <w:r>
-        <w:rPr>
-          <w:bCs/>
-          <w:b/>
-        </w:rPr>
-        <w:t xml:space="preserve">Topo:</w:t>
-      </w:r>
-      <w:r>
-        <w:t xml:space="preserve"> </w:t>
-      </w:r>
-      <w:r>
-        <w:t xml:space="preserve">Reels editoriais para alcance e conhecimento.</w:t>
-      </w:r>
-      <w:r>
-        <w:t xml:space="preserve"> </w:t>
-      </w:r>
-      <w:r>
-        <w:rPr>
-          <w:bCs/>
-          <w:b/>
-        </w:rPr>
-        <w:t xml:space="preserve">Meio:</w:t>
-      </w:r>
-      <w:r>
-        <w:t xml:space="preserve"> </w:t>
-      </w:r>
-      <w:r>
-        <w:t xml:space="preserve">comparativos de tecido, depoimentos, quiz de tecido.</w:t>
-      </w:r>
-      <w:r>
-        <w:t xml:space="preserve"> </w:t>
-      </w:r>
-      <w:r>
-        <w:rPr>
-          <w:bCs/>
-          <w:b/>
-        </w:rPr>
-        <w:t xml:space="preserve">Fundo:</w:t>
-      </w:r>
-      <w:r>
-        <w:t xml:space="preserve"> </w:t>
-      </w:r>
-      <w:r>
-        <w:t xml:space="preserve">Google, remarketing e WhatsApp consultivo.</w:t>
-      </w:r>
-      <w:r>
-        <w:t xml:space="preserve"> </w:t>
-      </w:r>
-      <w:r>
-        <w:rPr>
-          <w:bCs/>
-          <w:b/>
-        </w:rPr>
-        <w:t xml:space="preserve">Pós:</w:t>
-      </w:r>
-      <w:r>
-        <w:t xml:space="preserve"> </w:t>
-      </w:r>
-      <w:r>
-        <w:t xml:space="preserve">avaliação, cuidado com o tecido e recompra.</w:t>
-      </w:r>
-    </w:p>
-    <w:bookmarkEnd w:id="37"/>
-    <w:bookmarkStart w:id="38" w:name="X930def7c06070435b5d6cc479e5da57166da1a8"/>
-    <w:p>
-      <w:pPr>
-        <w:pStyle w:val="Heading2"/>
-      </w:pPr>
-      <w:r>
-        <w:t xml:space="preserve">Mensagens e conteúdo (AIDA, Método da Pipoca)</w:t>
-      </w:r>
-    </w:p>
-    <w:p>
-      <w:pPr>
-        <w:pStyle w:val="FirstParagraph"/>
-      </w:pPr>
-      <w:r>
-        <w:rPr>
-          <w:iCs/>
-          <w:i/>
-        </w:rPr>
-        <w:t xml:space="preserve">Tom: curadoria, exclusividade, atendimento e presente. Sem preço, cupom, contagem regressiva ou urgência de preço.</w:t>
       </w:r>
     </w:p>
     <w:p>
@@ -3972,13 +4102,61 @@
           <w:bCs/>
           <w:b/>
         </w:rPr>
-        <w:t xml:space="preserve">AIDA (Meta):</w:t>
-      </w:r>
-      <w:r>
-        <w:t xml:space="preserve"> </w:t>
-      </w:r>
-      <w:r>
-        <w:t xml:space="preserve">Atenção: "Você já dormiu em Supima 1000 fios?" | Interesse: "Algodão de fibra longa, toque macio e acabamento que dura." | Desejo: "Peças escolhidas com curadoria para transformar o seu quarto no melhor lugar da casa." | Ação: "Conheça a coleção" ou "Fale com uma consultora no WhatsApp".</w:t>
+        <w:t xml:space="preserve">Produto:</w:t>
+      </w:r>
+      <w:r>
+        <w:t xml:space="preserve"> </w:t>
+      </w:r>
+      <w:r>
+        <w:t xml:space="preserve">kits curados por perfil (calor, frio, presente).</w:t>
+      </w:r>
+      <w:r>
+        <w:t xml:space="preserve"> </w:t>
+      </w:r>
+      <w:r>
+        <w:rPr>
+          <w:bCs/>
+          <w:b/>
+        </w:rPr>
+        <w:t xml:space="preserve">Preço:</w:t>
+      </w:r>
+      <w:r>
+        <w:t xml:space="preserve"> </w:t>
+      </w:r>
+      <w:r>
+        <w:t xml:space="preserve">premium, sem desconto como argumento.</w:t>
+      </w:r>
+      <w:r>
+        <w:t xml:space="preserve"> </w:t>
+      </w:r>
+      <w:r>
+        <w:rPr>
+          <w:bCs/>
+          <w:b/>
+        </w:rPr>
+        <w:t xml:space="preserve">Praça:</w:t>
+      </w:r>
+      <w:r>
+        <w:t xml:space="preserve"> </w:t>
+      </w:r>
+      <w:r>
+        <w:t xml:space="preserve">site, WhatsApp, showroom.</w:t>
+      </w:r>
+      <w:r>
+        <w:t xml:space="preserve"> </w:t>
+      </w:r>
+      <w:r>
+        <w:rPr>
+          <w:bCs/>
+          <w:b/>
+        </w:rPr>
+        <w:t xml:space="preserve">Promoção:</w:t>
+      </w:r>
+      <w:r>
+        <w:t xml:space="preserve"> </w:t>
+      </w:r>
+      <w:r>
+        <w:t xml:space="preserve">Instagram e TikTok orgânicos, parcerias de design e mídia paga.</w:t>
       </w:r>
     </w:p>
     <w:p>
@@ -3994,89 +4172,83 @@
           <w:bCs/>
           <w:b/>
         </w:rPr>
-        <w:t xml:space="preserve">AIDA presente:</w:t>
-      </w:r>
-      <w:r>
-        <w:t xml:space="preserve"> </w:t>
-      </w:r>
-      <w:r>
-        <w:t xml:space="preserve">Atenção: "O presente que a casa inteira vai notar." | Interesse: "Coleções exclusivas de cama, banho e decoração, com embalagem para presente." | Desejo: "Quem recebe sente o cuidado em cada detalhe." | Ação: "Conheça as coleções."</w:t>
-      </w:r>
-    </w:p>
-    <w:p>
-      <w:pPr>
-        <w:numPr>
-          <w:ilvl w:val="0"/>
-          <w:numId w:val="1011"/>
-        </w:numPr>
-        <w:pStyle w:val="Compact"/>
-      </w:pPr>
+        <w:t xml:space="preserve">Topo:</w:t>
+      </w:r>
+      <w:r>
+        <w:t xml:space="preserve"> </w:t>
+      </w:r>
+      <w:r>
+        <w:t xml:space="preserve">Reels editoriais para alcance e conhecimento.</w:t>
+      </w:r>
+      <w:r>
+        <w:t xml:space="preserve"> </w:t>
+      </w:r>
       <w:r>
         <w:rPr>
           <w:bCs/>
           <w:b/>
         </w:rPr>
-        <w:t xml:space="preserve">Google (títulos, até 30 caracteres):</w:t>
-      </w:r>
-      <w:r>
-        <w:t xml:space="preserve"> </w:t>
-      </w:r>
-      <w:r>
-        <w:t xml:space="preserve">Lençol Supima 1000 Fios | Naturalle Home Oficial | Enxoval de Luxo Naturalle | Cama de Hotel na Sua Casa | Coleções Exclusivas de Cama | Embalagem para Presente | Tecidos Percal, Cetim, Supima | Fale com uma Consultora | Peças Artesanais Exclusivas</w:t>
-      </w:r>
-    </w:p>
-    <w:p>
-      <w:pPr>
-        <w:numPr>
-          <w:ilvl w:val="0"/>
-          <w:numId w:val="1011"/>
-        </w:numPr>
-        <w:pStyle w:val="Compact"/>
-      </w:pPr>
+        <w:t xml:space="preserve">Meio:</w:t>
+      </w:r>
+      <w:r>
+        <w:t xml:space="preserve"> </w:t>
+      </w:r>
+      <w:r>
+        <w:t xml:space="preserve">comparativos de tecido, depoimentos, quiz de tecido.</w:t>
+      </w:r>
+      <w:r>
+        <w:t xml:space="preserve"> </w:t>
+      </w:r>
       <w:r>
         <w:rPr>
           <w:bCs/>
           <w:b/>
         </w:rPr>
-        <w:t xml:space="preserve">Google (descrições, até 90 caracteres):</w:t>
-      </w:r>
-      <w:r>
-        <w:t xml:space="preserve"> </w:t>
-      </w:r>
-      <w:r>
-        <w:t xml:space="preserve">"Algodão de fibra longa com toque macio. Escolha seu tecido com ajuda de uma consultora." | "Coleções exclusivas de cama, banho e decoração. Embalagem para presente e troca facilitada." Condições de pagamento ficam como extensões, não como título. Confirmar no site antes de publicar.</w:t>
-      </w:r>
-    </w:p>
-    <w:p>
-      <w:pPr>
-        <w:numPr>
-          <w:ilvl w:val="0"/>
-          <w:numId w:val="1011"/>
-        </w:numPr>
-        <w:pStyle w:val="Compact"/>
-      </w:pPr>
+        <w:t xml:space="preserve">Fundo:</w:t>
+      </w:r>
+      <w:r>
+        <w:t xml:space="preserve"> </w:t>
+      </w:r>
+      <w:r>
+        <w:t xml:space="preserve">Google, remarketing e WhatsApp consultivo.</w:t>
+      </w:r>
+      <w:r>
+        <w:t xml:space="preserve"> </w:t>
+      </w:r>
       <w:r>
         <w:rPr>
           <w:bCs/>
           <w:b/>
         </w:rPr>
-        <w:t xml:space="preserve">Pipoca (tema "tecido e sono de luxo"):</w:t>
-      </w:r>
-      <w:r>
-        <w:t xml:space="preserve"> </w:t>
-      </w:r>
-      <w:r>
-        <w:t xml:space="preserve">dúvida (quantos fios?), mito (mais fios é melhor?), bastidor (showroom e artesanal), benefício (Supima dura mais), tutorial (lavar enxoval premium), comparação (Percal x Cetim x Supima), case (quarto montado por cliente), opinião (kit favorito da curadora), lista (5 peças de hotel boutique), tendência (cores da estação).</w:t>
+        <w:t xml:space="preserve">Pós:</w:t>
+      </w:r>
+      <w:r>
+        <w:t xml:space="preserve"> </w:t>
+      </w:r>
+      <w:r>
+        <w:t xml:space="preserve">avaliação, cuidado com o tecido e recompra.</w:t>
       </w:r>
     </w:p>
     <w:bookmarkEnd w:id="38"/>
-    <w:bookmarkStart w:id="39" w:name="indicadores-táticos"/>
+    <w:bookmarkStart w:id="39" w:name="X930def7c06070435b5d6cc479e5da57166da1a8"/>
     <w:p>
       <w:pPr>
         <w:pStyle w:val="Heading2"/>
       </w:pPr>
       <w:r>
-        <w:t xml:space="preserve">Indicadores táticos</w:t>
+        <w:t xml:space="preserve">Mensagens e conteúdo (AIDA, Método da Pipoca)</w:t>
+      </w:r>
+    </w:p>
+    <w:p>
+      <w:pPr>
+        <w:pStyle w:val="FirstParagraph"/>
+      </w:pPr>
+      <w:r>
+        <w:rPr>
+          <w:iCs/>
+          <w:i/>
+        </w:rPr>
+        <w:t xml:space="preserve">Tom: curadoria, exclusividade, atendimento e presente. Sem preço, cupom, contagem regressiva ou urgência de preço.</w:t>
       </w:r>
     </w:p>
     <w:p>
@@ -4092,13 +4264,13 @@
           <w:bCs/>
           <w:b/>
         </w:rPr>
-        <w:t xml:space="preserve">Etapa 1:</w:t>
-      </w:r>
-      <w:r>
-        <w:t xml:space="preserve"> </w:t>
-      </w:r>
-      <w:r>
-        <w:t xml:space="preserve">CPM (referência R$ 18,04), custo por visita ao perfil (referência R$ 0,40; melhor R$ 0,36), frequência semanal, alcance, cliques para o site, eventos de pixel disparando (visualização, carrinho, compra).</w:t>
+        <w:t xml:space="preserve">AIDA (Meta):</w:t>
+      </w:r>
+      <w:r>
+        <w:t xml:space="preserve"> </w:t>
+      </w:r>
+      <w:r>
+        <w:t xml:space="preserve">Atenção: "Você já dormiu em Supima 1000 fios?" | Interesse: "Algodão de fibra longa, toque macio e acabamento que dura." | Desejo: "Peças escolhidas com curadoria para transformar o seu quarto no melhor lugar da casa." | Ação: "Conheça a coleção" ou "Fale com uma consultora no WhatsApp".</w:t>
       </w:r>
     </w:p>
     <w:p>
@@ -4114,6 +4286,126 @@
           <w:bCs/>
           <w:b/>
         </w:rPr>
+        <w:t xml:space="preserve">AIDA presente:</w:t>
+      </w:r>
+      <w:r>
+        <w:t xml:space="preserve"> </w:t>
+      </w:r>
+      <w:r>
+        <w:t xml:space="preserve">Atenção: "O presente que a casa inteira vai notar." | Interesse: "Coleções exclusivas de cama, banho e decoração, com embalagem para presente." | Desejo: "Quem recebe sente o cuidado em cada detalhe." | Ação: "Conheça as coleções."</w:t>
+      </w:r>
+    </w:p>
+    <w:p>
+      <w:pPr>
+        <w:numPr>
+          <w:ilvl w:val="0"/>
+          <w:numId w:val="1012"/>
+        </w:numPr>
+        <w:pStyle w:val="Compact"/>
+      </w:pPr>
+      <w:r>
+        <w:rPr>
+          <w:bCs/>
+          <w:b/>
+        </w:rPr>
+        <w:t xml:space="preserve">Google (títulos, até 30 caracteres):</w:t>
+      </w:r>
+      <w:r>
+        <w:t xml:space="preserve"> </w:t>
+      </w:r>
+      <w:r>
+        <w:t xml:space="preserve">Lençol Supima 1000 Fios | Naturalle Home Oficial | Enxoval de Luxo Naturalle | Cama de Hotel na Sua Casa | Coleções Exclusivas de Cama | Embalagem para Presente | Tecidos Percal, Cetim, Supima | Fale com uma Consultora | Peças Artesanais Exclusivas</w:t>
+      </w:r>
+    </w:p>
+    <w:p>
+      <w:pPr>
+        <w:numPr>
+          <w:ilvl w:val="0"/>
+          <w:numId w:val="1012"/>
+        </w:numPr>
+        <w:pStyle w:val="Compact"/>
+      </w:pPr>
+      <w:r>
+        <w:rPr>
+          <w:bCs/>
+          <w:b/>
+        </w:rPr>
+        <w:t xml:space="preserve">Google (descrições, até 90 caracteres):</w:t>
+      </w:r>
+      <w:r>
+        <w:t xml:space="preserve"> </w:t>
+      </w:r>
+      <w:r>
+        <w:t xml:space="preserve">"Algodão de fibra longa com toque macio. Escolha seu tecido com ajuda de uma consultora." | "Coleções exclusivas de cama, banho e decoração. Embalagem para presente e troca facilitada." Condições de pagamento ficam como extensões, não como título. Não prometer "troca grátis": a política informa que só a primeira postagem é por conta da Naturalle. Confirmar no site antes de publicar.</w:t>
+      </w:r>
+    </w:p>
+    <w:p>
+      <w:pPr>
+        <w:numPr>
+          <w:ilvl w:val="0"/>
+          <w:numId w:val="1012"/>
+        </w:numPr>
+        <w:pStyle w:val="Compact"/>
+      </w:pPr>
+      <w:r>
+        <w:rPr>
+          <w:bCs/>
+          <w:b/>
+        </w:rPr>
+        <w:t xml:space="preserve">Pipoca (tema "tecido e sono de luxo"):</w:t>
+      </w:r>
+      <w:r>
+        <w:t xml:space="preserve"> </w:t>
+      </w:r>
+      <w:r>
+        <w:t xml:space="preserve">dúvida (quantos fios?), mito (mais fios é melhor?), bastidor (showroom e artesanal), benefício (Supima dura mais), tutorial (lavar enxoval premium), comparação (Percal x Cetim x Supima), case (quarto montado por cliente), opinião (kit favorito da curadora), lista (5 peças de hotel boutique), tendência (cores da estação).</w:t>
+      </w:r>
+    </w:p>
+    <w:bookmarkEnd w:id="39"/>
+    <w:bookmarkStart w:id="40" w:name="indicadores-táticos"/>
+    <w:p>
+      <w:pPr>
+        <w:pStyle w:val="Heading2"/>
+      </w:pPr>
+      <w:r>
+        <w:t xml:space="preserve">Indicadores táticos</w:t>
+      </w:r>
+    </w:p>
+    <w:p>
+      <w:pPr>
+        <w:numPr>
+          <w:ilvl w:val="0"/>
+          <w:numId w:val="1013"/>
+        </w:numPr>
+        <w:pStyle w:val="Compact"/>
+      </w:pPr>
+      <w:r>
+        <w:rPr>
+          <w:bCs/>
+          <w:b/>
+        </w:rPr>
+        <w:t xml:space="preserve">Etapa 1:</w:t>
+      </w:r>
+      <w:r>
+        <w:t xml:space="preserve"> </w:t>
+      </w:r>
+      <w:r>
+        <w:t xml:space="preserve">CPM (referência R$ 18,04), custo por visita ao perfil (referência R$ 0,40; melhor R$ 0,36), frequência semanal, alcance, cliques para o site, eventos de pixel disparando (visualização, carrinho, compra).</w:t>
+      </w:r>
+    </w:p>
+    <w:p>
+      <w:pPr>
+        <w:numPr>
+          <w:ilvl w:val="0"/>
+          <w:numId w:val="1013"/>
+        </w:numPr>
+        <w:pStyle w:val="Compact"/>
+      </w:pPr>
+      <w:r>
+        <w:rPr>
+          <w:bCs/>
+          <w:b/>
+        </w:rPr>
         <w:t xml:space="preserve">A partir da Etapa 2:</w:t>
       </w:r>
       <w:r>
@@ -4123,9 +4415,9 @@
         <w:t xml:space="preserve">ROAS e CAC por campanha, taxa de conversão do site, ticket médio, CTR e CPC, conversas de WhatsApp e % que viram venda, taxa de avaliações, resultado por faixa etária e por estado.</w:t>
       </w:r>
     </w:p>
-    <w:bookmarkEnd w:id="39"/>
     <w:bookmarkEnd w:id="40"/>
-    <w:bookmarkStart w:id="48" w:name="Xd47fde61dfeddc72a81a58b1871be2db3fb1064"/>
+    <w:bookmarkEnd w:id="41"/>
+    <w:bookmarkStart w:id="49" w:name="Xd47fde61dfeddc72a81a58b1871be2db3fb1064"/>
     <w:p>
       <w:pPr>
         <w:pStyle w:val="Heading1"/>
@@ -4146,7 +4438,7 @@
         <w:t xml:space="preserve">Responsáveis são sugestões. Ajuste à sua equipe.</w:t>
       </w:r>
     </w:p>
-    <w:bookmarkStart w:id="41" w:name="etapa-1-fundação-0810-a-2210"/>
+    <w:bookmarkStart w:id="42" w:name="etapa-1-fundação-0810-a-2210"/>
     <w:p>
       <w:pPr>
         <w:pStyle w:val="Heading2"/>
@@ -4232,7 +4524,7 @@
                 <w:rFonts w:ascii="Arial" w:hAnsi="Arial"/>
                 <w:sz w:val="17"/>
               </w:rPr>
-              <w:t xml:space="preserve">Verificar se pixel e GA4 já estão instalados no site e se os eventos (visualização de produto, carrinho, início de compra, compra com valor) disparam; identificar a plataforma do site</w:t>
+              <w:t xml:space="preserve">No Shopify, abrir Eventos do cliente e os canais de venda (Facebook &amp; Instagram e Google &amp; YouTube) e conferir quais pixels estão ativos e se os eventos (visualização de produto, carrinho, início de compra, compra com valor) disparam. Nome dos menus pode variar</w:t>
             </w:r>
           </w:p>
         </w:tc>
@@ -4266,7 +4558,41 @@
                 <w:rFonts w:ascii="Arial" w:hAnsi="Arial"/>
                 <w:sz w:val="17"/>
               </w:rPr>
-              <w:t xml:space="preserve">Verificar o domínio naturallehome.com.br no Business Manager da Sultan e deixar o pixel no portfólio Sultan, com permissões corretas</w:t>
+              <w:t xml:space="preserve">Exportar do Shopify (últimos 30 dias): sessões, taxa de conversão, ticket médio, pedidos e origem do tráfego. São os dados reais que substituem as hipóteses</w:t>
+            </w:r>
+          </w:p>
+        </w:tc>
+        <w:tc>
+          <w:tcPr/>
+          <w:p>
+            <w:pPr>
+              <w:pStyle w:val="Compact"/>
+              <w:jc w:val="left"/>
+            </w:pPr>
+            <w:r>
+              <w:rPr>
+                <w:rFonts w:ascii="Arial" w:hAnsi="Arial"/>
+                <w:sz w:val="17"/>
+              </w:rPr>
+              <w:t xml:space="preserve">E-commerce</w:t>
+            </w:r>
+          </w:p>
+        </w:tc>
+      </w:tr>
+      <w:tr>
+        <w:tc>
+          <w:tcPr/>
+          <w:p>
+            <w:pPr>
+              <w:pStyle w:val="Compact"/>
+              <w:jc w:val="left"/>
+            </w:pPr>
+            <w:r>
+              <w:rPr>
+                <w:rFonts w:ascii="Arial" w:hAnsi="Arial"/>
+                <w:sz w:val="17"/>
+              </w:rPr>
+              <w:t xml:space="preserve">Conectar o canal Facebook &amp; Instagram do Shopify ao Business Manager da Sultan, verificar o domínio naturallehome.com.br e deixar o pixel no portfólio Sultan, com compartilhamento de dados no nível máximo (que ativa a API de Conversões)</w:t>
             </w:r>
           </w:p>
         </w:tc>
@@ -4300,7 +4626,7 @@
                 <w:rFonts w:ascii="Arial" w:hAnsi="Arial"/>
                 <w:sz w:val="17"/>
               </w:rPr>
-              <w:t xml:space="preserve">Ativar a API de Conversões e importar a conversão de compra para o Google Ads (via GA4 ou tag)</w:t>
+              <w:t xml:space="preserve">Instalar o canal Google &amp; YouTube no Shopify (GA4, tag do Google Ads e feed do Merchant Center) e importar a conversão de compra para o Google Ads</w:t>
             </w:r>
           </w:p>
         </w:tc>
@@ -4334,6 +4660,40 @@
                 <w:rFonts w:ascii="Arial" w:hAnsi="Arial"/>
                 <w:sz w:val="17"/>
               </w:rPr>
+              <w:t xml:space="preserve">Criar a conversão "Agendar Visita" (envio do formulário) como evento no Meta, no GA4 e no Google Ads</w:t>
+            </w:r>
+          </w:p>
+        </w:tc>
+        <w:tc>
+          <w:tcPr/>
+          <w:p>
+            <w:pPr>
+              <w:pStyle w:val="Compact"/>
+              <w:jc w:val="left"/>
+            </w:pPr>
+            <w:r>
+              <w:rPr>
+                <w:rFonts w:ascii="Arial" w:hAnsi="Arial"/>
+                <w:sz w:val="17"/>
+              </w:rPr>
+              <w:t xml:space="preserve">Gestor de tráfego / dev</w:t>
+            </w:r>
+          </w:p>
+        </w:tc>
+      </w:tr>
+      <w:tr>
+        <w:tc>
+          <w:tcPr/>
+          <w:p>
+            <w:pPr>
+              <w:pStyle w:val="Compact"/>
+              <w:jc w:val="left"/>
+            </w:pPr>
+            <w:r>
+              <w:rPr>
+                <w:rFonts w:ascii="Arial" w:hAnsi="Arial"/>
+                <w:sz w:val="17"/>
+              </w:rPr>
               <w:t xml:space="preserve">Fazer compra de teste e conferir a venda no Meta, no Google e no GA4</w:t>
             </w:r>
           </w:p>
@@ -4368,7 +4728,7 @@
                 <w:rFonts w:ascii="Arial" w:hAnsi="Arial"/>
                 <w:sz w:val="17"/>
               </w:rPr>
-              <w:t xml:space="preserve">Criar o Merchant Center e aprovar o feed (título, foto de ambiente, GTIN quando houver); ativar o catálogo do Instagram Shopping</w:t>
+              <w:t xml:space="preserve">Aprovar o feed no Merchant Center (título, foto de ambiente, GTIN quando houver) e conferir o catálogo sincronizado com o Instagram Shopping</w:t>
             </w:r>
           </w:p>
         </w:tc>
@@ -4572,7 +4932,75 @@
                 <w:rFonts w:ascii="Arial" w:hAnsi="Arial"/>
                 <w:sz w:val="17"/>
               </w:rPr>
-              <w:t xml:space="preserve">Ativar avaliações no site e o pedido de avaliação com foto no pós-compra</w:t>
+              <w:t xml:space="preserve">Confirmar se há app de avaliações no site (não identifiquei na página inicial); se não houver, instalar um e ligar o pedido de avaliação com foto ao pós-compra no Klaviyo</w:t>
+            </w:r>
+          </w:p>
+        </w:tc>
+        <w:tc>
+          <w:tcPr/>
+          <w:p>
+            <w:pPr>
+              <w:pStyle w:val="Compact"/>
+              <w:jc w:val="left"/>
+            </w:pPr>
+            <w:r>
+              <w:rPr>
+                <w:rFonts w:ascii="Arial" w:hAnsi="Arial"/>
+                <w:sz w:val="17"/>
+              </w:rPr>
+              <w:t xml:space="preserve">E-commerce</w:t>
+            </w:r>
+          </w:p>
+        </w:tc>
+      </w:tr>
+      <w:tr>
+        <w:tc>
+          <w:tcPr/>
+          <w:p>
+            <w:pPr>
+              <w:pStyle w:val="Compact"/>
+              <w:jc w:val="left"/>
+            </w:pPr>
+            <w:r>
+              <w:rPr>
+                <w:rFonts w:ascii="Arial" w:hAnsi="Arial"/>
+                <w:sz w:val="17"/>
+              </w:rPr>
+              <w:t xml:space="preserve">Montar no Klaviyo os fluxos de carrinho abandonado, boas-vindas e pós-compra (avaliação e cuidado com o tecido)</w:t>
+            </w:r>
+          </w:p>
+        </w:tc>
+        <w:tc>
+          <w:tcPr/>
+          <w:p>
+            <w:pPr>
+              <w:pStyle w:val="Compact"/>
+              <w:jc w:val="left"/>
+            </w:pPr>
+            <w:r>
+              <w:rPr>
+                <w:rFonts w:ascii="Arial" w:hAnsi="Arial"/>
+                <w:sz w:val="17"/>
+              </w:rPr>
+              <w:t xml:space="preserve">E-commerce / CRM</w:t>
+            </w:r>
+          </w:p>
+        </w:tc>
+      </w:tr>
+      <w:tr>
+        <w:tc>
+          <w:tcPr/>
+          <w:p>
+            <w:pPr>
+              <w:pStyle w:val="Compact"/>
+              <w:jc w:val="left"/>
+            </w:pPr>
+            <w:r>
+              <w:rPr>
+                <w:rFonts w:ascii="Arial" w:hAnsi="Arial"/>
+                <w:sz w:val="17"/>
+              </w:rPr>
+              <w:t xml:space="preserve">Corrigir o link "WhatsApp" do rodapé do site (apareceu sem endereço) e combinar com o showroom o limite de visitas por semana</w:t>
             </w:r>
           </w:p>
         </w:tc>
@@ -4640,7 +5068,7 @@
                 <w:rFonts w:ascii="Arial" w:hAnsi="Arial"/>
                 <w:sz w:val="17"/>
               </w:rPr>
-              <w:t xml:space="preserve">Alinhar com os representantes a política de preço e condições online x offline</w:t>
+              <w:t xml:space="preserve">Definir com a área B2B a regra de preço público mínimo, para o site não concorrer com os lojistas</w:t>
             </w:r>
           </w:p>
         </w:tc>
@@ -4696,8 +5124,8 @@
         </w:tc>
       </w:tr>
     </w:tbl>
-    <w:bookmarkEnd w:id="41"/>
-    <w:bookmarkStart w:id="42" w:name="etapa-2-em-diante"/>
+    <w:bookmarkEnd w:id="42"/>
+    <w:bookmarkStart w:id="43" w:name="etapa-2-em-diante"/>
     <w:p>
       <w:pPr>
         <w:pStyle w:val="Heading2"/>
@@ -4941,60 +5369,14 @@
         </w:tc>
       </w:tr>
     </w:tbl>
-    <w:bookmarkEnd w:id="42"/>
-    <w:bookmarkStart w:id="43" w:name="rotina-diária-10-minutos"/>
+    <w:bookmarkEnd w:id="43"/>
+    <w:bookmarkStart w:id="44" w:name="rotina-diária-10-minutos"/>
     <w:p>
       <w:pPr>
         <w:pStyle w:val="Heading2"/>
       </w:pPr>
       <w:r>
         <w:t xml:space="preserve">Rotina diária (10 minutos)</w:t>
-      </w:r>
-    </w:p>
-    <w:p>
-      <w:pPr>
-        <w:numPr>
-          <w:ilvl w:val="0"/>
-          <w:numId w:val="1013"/>
-        </w:numPr>
-        <w:pStyle w:val="Compact"/>
-      </w:pPr>
-      <w:r>
-        <w:t xml:space="preserve">Ler o relatório automático das 8h: gasto, receita, ROAS, vendas e CAC por campanha (quando as conversões estiverem funcionando).</w:t>
-      </w:r>
-    </w:p>
-    <w:p>
-      <w:pPr>
-        <w:numPr>
-          <w:ilvl w:val="0"/>
-          <w:numId w:val="1013"/>
-        </w:numPr>
-        <w:pStyle w:val="Compact"/>
-      </w:pPr>
-      <w:r>
-        <w:t xml:space="preserve">Verificar anúncio reprovado, orçamento esgotado cedo, frequência acima do limite e erro de rastreamento.</w:t>
-      </w:r>
-    </w:p>
-    <w:p>
-      <w:pPr>
-        <w:numPr>
-          <w:ilvl w:val="0"/>
-          <w:numId w:val="1013"/>
-        </w:numPr>
-        <w:pStyle w:val="Compact"/>
-      </w:pPr>
-      <w:r>
-        <w:t xml:space="preserve">Responder rápido as conversas de WhatsApp.</w:t>
-      </w:r>
-    </w:p>
-    <w:bookmarkEnd w:id="43"/>
-    <w:bookmarkStart w:id="44" w:name="rotina-semanal-1-hora"/>
-    <w:p>
-      <w:pPr>
-        <w:pStyle w:val="Heading2"/>
-      </w:pPr>
-      <w:r>
-        <w:t xml:space="preserve">Rotina semanal (1 hora)</w:t>
       </w:r>
     </w:p>
     <w:p>
@@ -5006,7 +5388,7 @@
         <w:pStyle w:val="Compact"/>
       </w:pPr>
       <w:r>
-        <w:t xml:space="preserve">Comparar criativos por custo por visita ou por clique e CPM. Substituir o criativo que passar do nível do pior atual (cerca de R$ 0,60 por visita) ou que mostrar queda de alcance.</w:t>
+        <w:t xml:space="preserve">Ler o relatório automático das 8h: gasto, receita, ROAS, vendas e CAC por campanha (quando as conversões estiverem funcionando).</w:t>
       </w:r>
     </w:p>
     <w:p>
@@ -5018,7 +5400,7 @@
         <w:pStyle w:val="Compact"/>
       </w:pPr>
       <w:r>
-        <w:t xml:space="preserve">Analisar por faixa etária, estado e posicionamento (Feed, Reels, Stories).</w:t>
+        <w:t xml:space="preserve">Verificar anúncio reprovado, orçamento esgotado cedo, frequência acima do limite e erro de rastreamento.</w:t>
       </w:r>
     </w:p>
     <w:p>
@@ -5030,29 +5412,17 @@
         <w:pStyle w:val="Compact"/>
       </w:pPr>
       <w:r>
-        <w:t xml:space="preserve">Google: revisar termos de pesquisa e negativar o que não converte.</w:t>
-      </w:r>
-    </w:p>
-    <w:p>
-      <w:pPr>
-        <w:numPr>
-          <w:ilvl w:val="0"/>
-          <w:numId w:val="1014"/>
-        </w:numPr>
-        <w:pStyle w:val="Compact"/>
-      </w:pPr>
-      <w:r>
-        <w:t xml:space="preserve">Registrar as vendas fechadas por WhatsApp (para não sumirem do relatório).</w:t>
+        <w:t xml:space="preserve">Responder rápido as conversas de WhatsApp.</w:t>
       </w:r>
     </w:p>
     <w:bookmarkEnd w:id="44"/>
-    <w:bookmarkStart w:id="45" w:name="rotina-mensal-2-horas"/>
+    <w:bookmarkStart w:id="45" w:name="rotina-semanal-1-hora"/>
     <w:p>
       <w:pPr>
         <w:pStyle w:val="Heading2"/>
       </w:pPr>
       <w:r>
-        <w:t xml:space="preserve">Rotina mensal (2 horas)</w:t>
+        <w:t xml:space="preserve">Rotina semanal (1 hora)</w:t>
       </w:r>
     </w:p>
     <w:p>
@@ -5064,7 +5434,7 @@
         <w:pStyle w:val="Compact"/>
       </w:pPr>
       <w:r>
-        <w:t xml:space="preserve">Recalcular ticket médio, conversão e margem com dados reais; atualizar os cenários.</w:t>
+        <w:t xml:space="preserve">Comparar criativos por custo por visita ou por clique e CPM. Substituir o criativo que passar do nível do pior atual (cerca de R$ 0,60 por visita) ou que mostrar queda de alcance.</w:t>
       </w:r>
     </w:p>
     <w:p>
@@ -5076,7 +5446,7 @@
         <w:pStyle w:val="Compact"/>
       </w:pPr>
       <w:r>
-        <w:t xml:space="preserve">Comparar o perfil dos compradores (idade, estado, cidade) com o perfil da audiência.</w:t>
+        <w:t xml:space="preserve">Analisar por faixa etária, estado e posicionamento (Feed, Reels, Stories).</w:t>
       </w:r>
     </w:p>
     <w:p>
@@ -5088,7 +5458,7 @@
         <w:pStyle w:val="Compact"/>
       </w:pPr>
       <w:r>
-        <w:t xml:space="preserve">Decidir a verba do mês seguinte pelos critérios de avanço e pelo calendário comercial.</w:t>
+        <w:t xml:space="preserve">Google: revisar termos de pesquisa e negativar o que não converte.</w:t>
       </w:r>
     </w:p>
     <w:p>
@@ -5100,17 +5470,17 @@
         <w:pStyle w:val="Compact"/>
       </w:pPr>
       <w:r>
-        <w:t xml:space="preserve">Revisar posicionamento, oferta, prova social e política de preço.</w:t>
+        <w:t xml:space="preserve">Registrar as vendas fechadas por WhatsApp (para não sumirem do relatório).</w:t>
       </w:r>
     </w:p>
     <w:bookmarkEnd w:id="45"/>
-    <w:bookmarkStart w:id="46" w:name="regras-objetivas-de-decisão"/>
+    <w:bookmarkStart w:id="46" w:name="rotina-mensal-2-horas"/>
     <w:p>
       <w:pPr>
         <w:pStyle w:val="Heading2"/>
       </w:pPr>
       <w:r>
-        <w:t xml:space="preserve">Regras objetivas de decisão</w:t>
+        <w:t xml:space="preserve">Rotina mensal (2 horas)</w:t>
       </w:r>
     </w:p>
     <w:p>
@@ -5122,17 +5492,7 @@
         <w:pStyle w:val="Compact"/>
       </w:pPr>
       <w:r>
-        <w:rPr>
-          <w:bCs/>
-          <w:b/>
-        </w:rPr>
-        <w:t xml:space="preserve">Etapa 1, renovar:</w:t>
-      </w:r>
-      <w:r>
-        <w:t xml:space="preserve"> </w:t>
-      </w:r>
-      <w:r>
-        <w:t xml:space="preserve">criativo com custo por visita acima de cerca de R$ 0,60 depois de volume suficiente, ou com frequência alta e alcance em queda.</w:t>
+        <w:t xml:space="preserve">Recalcular ticket médio, conversão e margem com dados reais; atualizar os cenários.</w:t>
       </w:r>
     </w:p>
     <w:p>
@@ -5144,17 +5504,7 @@
         <w:pStyle w:val="Compact"/>
       </w:pPr>
       <w:r>
-        <w:rPr>
-          <w:bCs/>
-          <w:b/>
-        </w:rPr>
-        <w:t xml:space="preserve">Pausar:</w:t>
-      </w:r>
-      <w:r>
-        <w:t xml:space="preserve"> </w:t>
-      </w:r>
-      <w:r>
-        <w:t xml:space="preserve">campanha que gastou cerca de 2 vezes o CAC máximo sem venda (com rastreamento confirmado).</w:t>
+        <w:t xml:space="preserve">Comparar o perfil dos compradores (idade, estado, cidade) com o perfil da audiência.</w:t>
       </w:r>
     </w:p>
     <w:p>
@@ -5166,17 +5516,7 @@
         <w:pStyle w:val="Compact"/>
       </w:pPr>
       <w:r>
-        <w:rPr>
-          <w:bCs/>
-          <w:b/>
-        </w:rPr>
-        <w:t xml:space="preserve">Atenção:</w:t>
-      </w:r>
-      <w:r>
-        <w:t xml:space="preserve"> </w:t>
-      </w:r>
-      <w:r>
-        <w:t xml:space="preserve">ROAS abaixo do equilíbrio depois de gastar 1 vez o CAC máximo.</w:t>
+        <w:t xml:space="preserve">Decidir a verba do mês seguinte pelos critérios de avanço e pelo calendário comercial.</w:t>
       </w:r>
     </w:p>
     <w:p>
@@ -5188,77 +5528,17 @@
         <w:pStyle w:val="Compact"/>
       </w:pPr>
       <w:r>
-        <w:rPr>
-          <w:bCs/>
-          <w:b/>
-        </w:rPr>
-        <w:t xml:space="preserve">Escalar:</w:t>
-      </w:r>
-      <w:r>
-        <w:t xml:space="preserve"> </w:t>
-      </w:r>
-      <w:r>
-        <w:t xml:space="preserve">ROAS acima do alvo por 2 semanas seguidas; aumentar cerca de 20% da verba por vez.</w:t>
-      </w:r>
-    </w:p>
-    <w:p>
-      <w:pPr>
-        <w:numPr>
-          <w:ilvl w:val="0"/>
-          <w:numId w:val="1016"/>
-        </w:numPr>
-        <w:pStyle w:val="Compact"/>
-      </w:pPr>
-      <w:r>
-        <w:rPr>
-          <w:bCs/>
-          <w:b/>
-        </w:rPr>
-        <w:t xml:space="preserve">Se o ROAS ficar abaixo do equilíbrio por 60 dias:</w:t>
-      </w:r>
-      <w:r>
-        <w:t xml:space="preserve"> </w:t>
-      </w:r>
-      <w:r>
-        <w:t xml:space="preserve">o problema costuma estar em oferta, prova ou site, não no orçamento.</w:t>
+        <w:t xml:space="preserve">Revisar posicionamento, oferta, prova social e política de preço.</w:t>
       </w:r>
     </w:p>
     <w:bookmarkEnd w:id="46"/>
-    <w:bookmarkStart w:id="47" w:name="automação-n8n"/>
+    <w:bookmarkStart w:id="47" w:name="regras-objetivas-de-decisão"/>
     <w:p>
       <w:pPr>
         <w:pStyle w:val="Heading2"/>
       </w:pPr>
       <w:r>
-        <w:t xml:space="preserve">Automação (n8n)</w:t>
-      </w:r>
-    </w:p>
-    <w:p>
-      <w:pPr>
-        <w:pStyle w:val="FirstParagraph"/>
-      </w:pPr>
-      <w:r>
-        <w:t xml:space="preserve">Workflow de relatório diário às 8h: busca o resultado de ontem no Meta e no Google Ads, calcula gasto, receita, ROAS, vendas e CAC por campanha e envia resumo por WhatsApp com alertas de pausa. Arquivo workflow-n8n-relatorio-ads.json na pasta naturalle-home/ do repositório bloque. Só mostra receita depois que as conversões com valor estiverem funcionando (fim da Etapa 1). Antes de ativar: preencher IDs e credenciais, conferir as versões das APIs e fazer uma execução manual (a lógica foi testada só com dados simulados).</w:t>
-      </w:r>
-    </w:p>
-    <w:bookmarkEnd w:id="47"/>
-    <w:bookmarkEnd w:id="48"/>
-    <w:bookmarkStart w:id="51" w:name="sugestões-e-perguntas"/>
-    <w:p>
-      <w:pPr>
-        <w:pStyle w:val="Heading1"/>
-      </w:pPr>
-      <w:r>
-        <w:t xml:space="preserve">4. Sugestões e perguntas</w:t>
-      </w:r>
-    </w:p>
-    <w:bookmarkStart w:id="49" w:name="sugestões"/>
-    <w:p>
-      <w:pPr>
-        <w:pStyle w:val="Heading2"/>
-      </w:pPr>
-      <w:r>
-        <w:t xml:space="preserve">Sugestões</w:t>
+        <w:t xml:space="preserve">Regras objetivas de decisão</w:t>
       </w:r>
     </w:p>
     <w:p>
@@ -5274,13 +5554,13 @@
           <w:bCs/>
           <w:b/>
         </w:rPr>
-        <w:t xml:space="preserve">Primeiro medir, depois escalar:</w:t>
-      </w:r>
-      <w:r>
-        <w:t xml:space="preserve"> </w:t>
-      </w:r>
-      <w:r>
-        <w:t xml:space="preserve">com o site no ar, o maior ganho imediato é ter pixel, GA4 e conversões funcionando antes de aumentar a verba.</w:t>
+        <w:t xml:space="preserve">Etapa 1, renovar:</w:t>
+      </w:r>
+      <w:r>
+        <w:t xml:space="preserve"> </w:t>
+      </w:r>
+      <w:r>
+        <w:t xml:space="preserve">criativo com custo por visita acima de cerca de R$ 0,60 depois de volume suficiente, ou com frequência alta e alcance em queda.</w:t>
       </w:r>
     </w:p>
     <w:p>
@@ -5296,13 +5576,13 @@
           <w:bCs/>
           <w:b/>
         </w:rPr>
-        <w:t xml:space="preserve">Aproveitar a parceria com a Artefacto e os conteúdos "Heritage" e "Refúgios"</w:t>
-      </w:r>
-      <w:r>
-        <w:t xml:space="preserve"> </w:t>
-      </w:r>
-      <w:r>
-        <w:t xml:space="preserve">como criativos pagos: o orgânico já tem o padrão de luxo, falta levá-lo ao anúncio.</w:t>
+        <w:t xml:space="preserve">Pausar:</w:t>
+      </w:r>
+      <w:r>
+        <w:t xml:space="preserve"> </w:t>
+      </w:r>
+      <w:r>
+        <w:t xml:space="preserve">campanha que gastou cerca de 2 vezes o CAC máximo sem venda (com rastreamento confirmado).</w:t>
       </w:r>
     </w:p>
     <w:p>
@@ -5318,13 +5598,13 @@
           <w:bCs/>
           <w:b/>
         </w:rPr>
-        <w:t xml:space="preserve">Stories e Reels dedicados:</w:t>
-      </w:r>
-      <w:r>
-        <w:t xml:space="preserve"> </w:t>
-      </w:r>
-      <w:r>
-        <w:t xml:space="preserve">hoje 95% da entrega está em Feed e Reels, e os Stories quase não foram explorados.</w:t>
+        <w:t xml:space="preserve">Atenção:</w:t>
+      </w:r>
+      <w:r>
+        <w:t xml:space="preserve"> </w:t>
+      </w:r>
+      <w:r>
+        <w:t xml:space="preserve">ROAS abaixo do equilíbrio depois de gastar 1 vez o CAC máximo.</w:t>
       </w:r>
     </w:p>
     <w:p>
@@ -5340,13 +5620,13 @@
           <w:bCs/>
           <w:b/>
         </w:rPr>
-        <w:t xml:space="preserve">Praças de alta renda:</w:t>
-      </w:r>
-      <w:r>
-        <w:t xml:space="preserve"> </w:t>
-      </w:r>
-      <w:r>
-        <w:t xml:space="preserve">testar DF, MT/MS e CE com verba pequena e comparar CPM e custo por visita contra o núcleo.</w:t>
+        <w:t xml:space="preserve">Escalar:</w:t>
+      </w:r>
+      <w:r>
+        <w:t xml:space="preserve"> </w:t>
+      </w:r>
+      <w:r>
+        <w:t xml:space="preserve">ROAS acima do alvo por 2 semanas seguidas; aumentar cerca de 20% da verba por vez.</w:t>
       </w:r>
     </w:p>
     <w:p>
@@ -5362,111 +5642,51 @@
           <w:bCs/>
           <w:b/>
         </w:rPr>
-        <w:t xml:space="preserve">Black Friday sem desconto agressivo:</w:t>
-      </w:r>
-      <w:r>
-        <w:t xml:space="preserve"> </w:t>
-      </w:r>
-      <w:r>
-        <w:t xml:space="preserve">brinde, embalagem para presente, atendimento ou frete, em vez de percentual (hipótese a testar).</w:t>
-      </w:r>
-    </w:p>
-    <w:p>
-      <w:pPr>
-        <w:numPr>
-          <w:ilvl w:val="0"/>
-          <w:numId w:val="1017"/>
-        </w:numPr>
-        <w:pStyle w:val="Compact"/>
-      </w:pPr>
-      <w:r>
-        <w:rPr>
-          <w:bCs/>
-          <w:b/>
-        </w:rPr>
-        <w:t xml:space="preserve">Captar e-mail e WhatsApp no site</w:t>
-      </w:r>
-      <w:r>
-        <w:t xml:space="preserve"> </w:t>
-      </w:r>
-      <w:r>
-        <w:t xml:space="preserve">de forma discreta (cadastro de novidades), para alimentar remarketing, lançamentos de coleção e públicos semelhantes de compradores.</w:t>
-      </w:r>
-    </w:p>
-    <w:p>
-      <w:pPr>
-        <w:numPr>
-          <w:ilvl w:val="0"/>
-          <w:numId w:val="1017"/>
-        </w:numPr>
-        <w:pStyle w:val="Compact"/>
-      </w:pPr>
-      <w:r>
-        <w:rPr>
-          <w:bCs/>
-          <w:b/>
-        </w:rPr>
-        <w:t xml:space="preserve">Prova social de clientes de 45 a 64 anos,</w:t>
-      </w:r>
-      <w:r>
-        <w:t xml:space="preserve"> </w:t>
-      </w:r>
-      <w:r>
-        <w:t xml:space="preserve">o grupo de maior peso no engajamento.</w:t>
-      </w:r>
-    </w:p>
-    <w:p>
-      <w:pPr>
-        <w:numPr>
-          <w:ilvl w:val="0"/>
-          <w:numId w:val="1017"/>
-        </w:numPr>
-        <w:pStyle w:val="Compact"/>
-      </w:pPr>
-      <w:r>
-        <w:rPr>
-          <w:bCs/>
-          <w:b/>
-        </w:rPr>
-        <w:t xml:space="preserve">Blog do site</w:t>
-      </w:r>
-      <w:r>
-        <w:t xml:space="preserve"> </w:t>
-      </w:r>
-      <w:r>
-        <w:t xml:space="preserve">reaproveitando os roteiros validados nas redes, para capturar busca no Google.</w:t>
-      </w:r>
-    </w:p>
-    <w:p>
-      <w:pPr>
-        <w:numPr>
-          <w:ilvl w:val="0"/>
-          <w:numId w:val="1017"/>
-        </w:numPr>
-        <w:pStyle w:val="Compact"/>
-      </w:pPr>
-      <w:r>
-        <w:rPr>
-          <w:bCs/>
-          <w:b/>
-        </w:rPr>
-        <w:t xml:space="preserve">TikTok somente no orgânico por ora</w:t>
-      </w:r>
-      <w:r>
-        <w:t xml:space="preserve"> </w:t>
-      </w:r>
-      <w:r>
-        <w:t xml:space="preserve">(hipótese: o público de 45 a 64 anos concentra-se mais em Instagram e Facebook).</w:t>
-      </w:r>
-    </w:p>
+        <w:t xml:space="preserve">Se o ROAS ficar abaixo do equilíbrio por 60 dias:</w:t>
+      </w:r>
+      <w:r>
+        <w:t xml:space="preserve"> </w:t>
+      </w:r>
+      <w:r>
+        <w:t xml:space="preserve">o problema costuma estar em oferta, prova ou site, não no orçamento.</w:t>
+      </w:r>
+    </w:p>
+    <w:bookmarkEnd w:id="47"/>
+    <w:bookmarkStart w:id="48" w:name="automação-n8n"/>
+    <w:p>
+      <w:pPr>
+        <w:pStyle w:val="Heading2"/>
+      </w:pPr>
+      <w:r>
+        <w:t xml:space="preserve">Automação (n8n)</w:t>
+      </w:r>
+    </w:p>
+    <w:p>
+      <w:pPr>
+        <w:pStyle w:val="FirstParagraph"/>
+      </w:pPr>
+      <w:r>
+        <w:t xml:space="preserve">Workflow de relatório diário às 8h: busca o resultado de ontem no Meta e no Google Ads, calcula gasto, receita, ROAS, vendas e CAC por campanha e envia resumo por WhatsApp com alertas de pausa. Arquivo workflow-n8n-relatorio-ads.json na pasta naturalle-home/ do repositório bloque. Só mostra receita depois que as conversões com valor estiverem funcionando (fim da Etapa 1). Como evolução, o workflow pode buscar também pedidos e receita do Shopify, que passa a ser a fonte da verdade para comparar com o ROAS das plataformas. Antes de ativar: preencher IDs e credenciais, conferir as versões das APIs e fazer uma execução manual (a lógica foi testada só com dados simulados).</w:t>
+      </w:r>
+    </w:p>
+    <w:bookmarkEnd w:id="48"/>
     <w:bookmarkEnd w:id="49"/>
-    <w:bookmarkStart w:id="50" w:name="perguntas-que-me-ajudam-a-refinar"/>
+    <w:bookmarkStart w:id="52" w:name="sugestões-e-perguntas"/>
+    <w:p>
+      <w:pPr>
+        <w:pStyle w:val="Heading1"/>
+      </w:pPr>
+      <w:r>
+        <w:t xml:space="preserve">4. Sugestões e perguntas</w:t>
+      </w:r>
+    </w:p>
+    <w:bookmarkStart w:id="50" w:name="sugestões"/>
     <w:p>
       <w:pPr>
         <w:pStyle w:val="Heading2"/>
       </w:pPr>
       <w:r>
-        <w:t xml:space="preserve">Perguntas que me ajudam a refinar</w:t>
+        <w:t xml:space="preserve">Sugestões</w:t>
       </w:r>
     </w:p>
     <w:p>
@@ -5478,7 +5698,17 @@
         <w:pStyle w:val="Compact"/>
       </w:pPr>
       <w:r>
-        <w:t xml:space="preserve">Em que plataforma o site foi feito (Shopify, Nuvemshop, VTEX, outra) e já tem pixel e GA4 instalados?</w:t>
+        <w:rPr>
+          <w:bCs/>
+          <w:b/>
+        </w:rPr>
+        <w:t xml:space="preserve">Primeiro medir, depois escalar:</w:t>
+      </w:r>
+      <w:r>
+        <w:t xml:space="preserve"> </w:t>
+      </w:r>
+      <w:r>
+        <w:t xml:space="preserve">com o site no ar, o maior ganho imediato é ter pixel, GA4 e conversões funcionando antes de aumentar a verba.</w:t>
       </w:r>
     </w:p>
     <w:p>
@@ -5490,7 +5720,17 @@
         <w:pStyle w:val="Compact"/>
       </w:pPr>
       <w:r>
-        <w:t xml:space="preserve">Qual é a política de preço dos representantes para o consumidor final, e há alguma oferta de entrada prevista?</w:t>
+        <w:rPr>
+          <w:bCs/>
+          <w:b/>
+        </w:rPr>
+        <w:t xml:space="preserve">Aproveitar a parceria com a Artefacto e os conteúdos "Heritage" e "Refúgios"</w:t>
+      </w:r>
+      <w:r>
+        <w:t xml:space="preserve"> </w:t>
+      </w:r>
+      <w:r>
+        <w:t xml:space="preserve">como criativos pagos: o orgânico já tem o padrão de luxo, falta levá-lo ao anúncio.</w:t>
       </w:r>
     </w:p>
     <w:p>
@@ -5502,7 +5742,17 @@
         <w:pStyle w:val="Compact"/>
       </w:pPr>
       <w:r>
-        <w:t xml:space="preserve">Há dados dos compradores atuais (idade, estado, ticket)?</w:t>
+        <w:rPr>
+          <w:bCs/>
+          <w:b/>
+        </w:rPr>
+        <w:t xml:space="preserve">Stories e Reels dedicados:</w:t>
+      </w:r>
+      <w:r>
+        <w:t xml:space="preserve"> </w:t>
+      </w:r>
+      <w:r>
+        <w:t xml:space="preserve">hoje 95% da entrega está em Feed e Reels, e os Stories quase não foram explorados.</w:t>
       </w:r>
     </w:p>
     <w:p>
@@ -5514,30 +5764,286 @@
         <w:pStyle w:val="Compact"/>
       </w:pPr>
       <w:r>
-        <w:t xml:space="preserve">Onde fica o showroom e quais regiões a logística atende melhor?</w:t>
-      </w:r>
-    </w:p>
-    <w:bookmarkEnd w:id="50"/>
-    <w:bookmarkEnd w:id="51"/>
-    <w:bookmarkStart w:id="52" w:name="próximo-passo-hoje"/>
-    <w:p>
-      <w:pPr>
-        <w:pStyle w:val="Heading1"/>
-      </w:pPr>
-      <w:r>
-        <w:t xml:space="preserve">Próximo passo (hoje)</w:t>
-      </w:r>
-    </w:p>
-    <w:p>
-      <w:pPr>
-        <w:pStyle w:val="FirstParagraph"/>
-      </w:pPr>
-      <w:r>
         <w:rPr>
           <w:bCs/>
           <w:b/>
         </w:rPr>
-        <w:t xml:space="preserve">Verificar se pixel e GA4 estão instalados e disparando no site, e fazer uma compra de teste.</w:t>
+        <w:t xml:space="preserve">Praças de alta renda:</w:t>
+      </w:r>
+      <w:r>
+        <w:t xml:space="preserve"> </w:t>
+      </w:r>
+      <w:r>
+        <w:t xml:space="preserve">testar DF, MT/MS e CE com verba pequena e comparar CPM e custo por visita contra o núcleo.</w:t>
+      </w:r>
+    </w:p>
+    <w:p>
+      <w:pPr>
+        <w:numPr>
+          <w:ilvl w:val="0"/>
+          <w:numId w:val="1018"/>
+        </w:numPr>
+        <w:pStyle w:val="Compact"/>
+      </w:pPr>
+      <w:r>
+        <w:rPr>
+          <w:bCs/>
+          <w:b/>
+        </w:rPr>
+        <w:t xml:space="preserve">Black Friday sem desconto agressivo:</w:t>
+      </w:r>
+      <w:r>
+        <w:t xml:space="preserve"> </w:t>
+      </w:r>
+      <w:r>
+        <w:t xml:space="preserve">brinde, embalagem para presente, atendimento ou frete, em vez de percentual (hipótese a testar).</w:t>
+      </w:r>
+    </w:p>
+    <w:p>
+      <w:pPr>
+        <w:numPr>
+          <w:ilvl w:val="0"/>
+          <w:numId w:val="1018"/>
+        </w:numPr>
+        <w:pStyle w:val="Compact"/>
+      </w:pPr>
+      <w:r>
+        <w:rPr>
+          <w:bCs/>
+          <w:b/>
+        </w:rPr>
+        <w:t xml:space="preserve">Usar o Klaviyo que já está instalado:</w:t>
+      </w:r>
+      <w:r>
+        <w:t xml:space="preserve"> </w:t>
+      </w:r>
+      <w:r>
+        <w:t xml:space="preserve">fluxos de carrinho abandonado, boas-vindas e pós-compra, e sincronizar a lista de clientes com o Meta para públicos semelhantes de compradores (com consentimento).</w:t>
+      </w:r>
+    </w:p>
+    <w:p>
+      <w:pPr>
+        <w:numPr>
+          <w:ilvl w:val="0"/>
+          <w:numId w:val="1018"/>
+        </w:numPr>
+        <w:pStyle w:val="Compact"/>
+      </w:pPr>
+      <w:r>
+        <w:rPr>
+          <w:bCs/>
+          <w:b/>
+        </w:rPr>
+        <w:t xml:space="preserve">Shopify como fonte da verdade:</w:t>
+      </w:r>
+      <w:r>
+        <w:t xml:space="preserve"> </w:t>
+      </w:r>
+      <w:r>
+        <w:t xml:space="preserve">comparar receita, pedidos e ticket do Shopify com o que Meta e Google reportam, para não decidir só pelo número das plataformas.</w:t>
+      </w:r>
+    </w:p>
+    <w:p>
+      <w:pPr>
+        <w:numPr>
+          <w:ilvl w:val="0"/>
+          <w:numId w:val="1018"/>
+        </w:numPr>
+        <w:pStyle w:val="Compact"/>
+      </w:pPr>
+      <w:r>
+        <w:rPr>
+          <w:bCs/>
+          <w:b/>
+        </w:rPr>
+        <w:t xml:space="preserve">Showroom como diferencial de conversão em São Paulo:</w:t>
+      </w:r>
+      <w:r>
+        <w:t xml:space="preserve"> </w:t>
+      </w:r>
+      <w:r>
+        <w:t xml:space="preserve">campanha de agendamento com limite de agenda combinado com a equipe.</w:t>
+      </w:r>
+    </w:p>
+    <w:p>
+      <w:pPr>
+        <w:numPr>
+          <w:ilvl w:val="0"/>
+          <w:numId w:val="1018"/>
+        </w:numPr>
+        <w:pStyle w:val="Compact"/>
+      </w:pPr>
+      <w:r>
+        <w:rPr>
+          <w:bCs/>
+          <w:b/>
+        </w:rPr>
+        <w:t xml:space="preserve">Ocasiões de maior valor:</w:t>
+      </w:r>
+      <w:r>
+        <w:t xml:space="preserve"> </w:t>
+      </w:r>
+      <w:r>
+        <w:t xml:space="preserve">testar enxoval e presente de casamento e reforma como ângulos de criativo (hipótese).</w:t>
+      </w:r>
+    </w:p>
+    <w:p>
+      <w:pPr>
+        <w:numPr>
+          <w:ilvl w:val="0"/>
+          <w:numId w:val="1018"/>
+        </w:numPr>
+        <w:pStyle w:val="Compact"/>
+      </w:pPr>
+      <w:r>
+        <w:rPr>
+          <w:bCs/>
+          <w:b/>
+        </w:rPr>
+        <w:t xml:space="preserve">Prova social de clientes de 45 a 64 anos,</w:t>
+      </w:r>
+      <w:r>
+        <w:t xml:space="preserve"> </w:t>
+      </w:r>
+      <w:r>
+        <w:t xml:space="preserve">o grupo de maior peso no engajamento.</w:t>
+      </w:r>
+    </w:p>
+    <w:p>
+      <w:pPr>
+        <w:numPr>
+          <w:ilvl w:val="0"/>
+          <w:numId w:val="1018"/>
+        </w:numPr>
+        <w:pStyle w:val="Compact"/>
+      </w:pPr>
+      <w:r>
+        <w:rPr>
+          <w:bCs/>
+          <w:b/>
+        </w:rPr>
+        <w:t xml:space="preserve">Blog do site</w:t>
+      </w:r>
+      <w:r>
+        <w:t xml:space="preserve"> </w:t>
+      </w:r>
+      <w:r>
+        <w:t xml:space="preserve">reaproveitando os roteiros validados nas redes, para capturar busca no Google.</w:t>
+      </w:r>
+    </w:p>
+    <w:p>
+      <w:pPr>
+        <w:numPr>
+          <w:ilvl w:val="0"/>
+          <w:numId w:val="1018"/>
+        </w:numPr>
+        <w:pStyle w:val="Compact"/>
+      </w:pPr>
+      <w:r>
+        <w:rPr>
+          <w:bCs/>
+          <w:b/>
+        </w:rPr>
+        <w:t xml:space="preserve">TikTok somente no orgânico por ora</w:t>
+      </w:r>
+      <w:r>
+        <w:t xml:space="preserve"> </w:t>
+      </w:r>
+      <w:r>
+        <w:t xml:space="preserve">(hipótese: o público de 45 a 64 anos concentra-se mais em Instagram e Facebook).</w:t>
+      </w:r>
+    </w:p>
+    <w:bookmarkEnd w:id="50"/>
+    <w:bookmarkStart w:id="51" w:name="perguntas-que-me-ajudam-a-refinar"/>
+    <w:p>
+      <w:pPr>
+        <w:pStyle w:val="Heading2"/>
+      </w:pPr>
+      <w:r>
+        <w:t xml:space="preserve">Perguntas que me ajudam a refinar</w:t>
+      </w:r>
+    </w:p>
+    <w:p>
+      <w:pPr>
+        <w:numPr>
+          <w:ilvl w:val="0"/>
+          <w:numId w:val="1019"/>
+        </w:numPr>
+        <w:pStyle w:val="Compact"/>
+      </w:pPr>
+      <w:r>
+        <w:t xml:space="preserve">Quais pixels e canais estão ativos no Shopify hoje (Facebook &amp; Instagram, Google &amp; YouTube)? Isso não dá para ver pelo lado de fora.</w:t>
+      </w:r>
+    </w:p>
+    <w:p>
+      <w:pPr>
+        <w:numPr>
+          <w:ilvl w:val="0"/>
+          <w:numId w:val="1019"/>
+        </w:numPr>
+        <w:pStyle w:val="Compact"/>
+      </w:pPr>
+      <w:r>
+        <w:t xml:space="preserve">Quais são os números do Shopify dos últimos 30 dias (sessões, taxa de conversão, ticket médio, pedidos, origem do tráfego)?</w:t>
+      </w:r>
+    </w:p>
+    <w:p>
+      <w:pPr>
+        <w:numPr>
+          <w:ilvl w:val="0"/>
+          <w:numId w:val="1019"/>
+        </w:numPr>
+        <w:pStyle w:val="Compact"/>
+      </w:pPr>
+      <w:r>
+        <w:t xml:space="preserve">Existe regra de preço público mínimo para os lojistas B2B, e há alguma oferta de entrada prevista para o consumidor final?</w:t>
+      </w:r>
+    </w:p>
+    <w:p>
+      <w:pPr>
+        <w:numPr>
+          <w:ilvl w:val="0"/>
+          <w:numId w:val="1019"/>
+        </w:numPr>
+        <w:pStyle w:val="Compact"/>
+      </w:pPr>
+      <w:r>
+        <w:t xml:space="preserve">Quantas visitas por semana o showroom comporta?</w:t>
+      </w:r>
+    </w:p>
+    <w:p>
+      <w:pPr>
+        <w:numPr>
+          <w:ilvl w:val="0"/>
+          <w:numId w:val="1019"/>
+        </w:numPr>
+        <w:pStyle w:val="Compact"/>
+      </w:pPr>
+      <w:r>
+        <w:t xml:space="preserve">Há dados dos compradores atuais (idade, estado, ticket)?</w:t>
+      </w:r>
+    </w:p>
+    <w:bookmarkEnd w:id="51"/>
+    <w:bookmarkEnd w:id="52"/>
+    <w:bookmarkStart w:id="53" w:name="próximo-passo-hoje"/>
+    <w:p>
+      <w:pPr>
+        <w:pStyle w:val="Heading1"/>
+      </w:pPr>
+      <w:r>
+        <w:t xml:space="preserve">Próximo passo (hoje)</w:t>
+      </w:r>
+    </w:p>
+    <w:p>
+      <w:pPr>
+        <w:pStyle w:val="FirstParagraph"/>
+      </w:pPr>
+      <w:r>
+        <w:rPr>
+          <w:bCs/>
+          <w:b/>
+        </w:rPr>
+        <w:t xml:space="preserve">No Shopify, conferir os pixels ativos (Eventos do cliente e canais Facebook &amp; Instagram e Google &amp; YouTube), exportar os números dos últimos 30 dias e fazer uma compra de teste.</w:t>
       </w:r>
       <w:r>
         <w:t xml:space="preserve"> </w:t>
@@ -5546,8 +6052,8 @@
         <w:t xml:space="preserve">Sem isso, a verba extra repete o problema do passado: gastar sem saber o que vende. Em paralelo, migrar do "turbinar" para o Gerenciador de Anúncios e criar o público de engajados do Instagram (365 dias).</w:t>
       </w:r>
     </w:p>
-    <w:bookmarkEnd w:id="52"/>
-    <w:bookmarkStart w:id="53" w:name="anexo-os-13-frameworks-aplicados-b2c"/>
+    <w:bookmarkEnd w:id="53"/>
+    <w:bookmarkStart w:id="54" w:name="anexo-os-13-frameworks-aplicados-b2c"/>
     <w:p>
       <w:pPr>
         <w:pStyle w:val="Heading1"/>
@@ -5670,7 +6176,7 @@
                 <w:rFonts w:ascii="Arial" w:hAnsi="Arial"/>
                 <w:sz w:val="17"/>
               </w:rPr>
-              <w:t xml:space="preserve">Cliente: mulheres de alto padrão, 35+, núcleo SP/MG/RJ/RS/SC/PR. Concorrência com desconto forte (Altenburg). Contexto: site recém-no-ar, datas comerciais fortes.</w:t>
+              <w:t xml:space="preserve">Cliente: mulheres de alto padrão, 35+, núcleo SP/MG/RJ/RS/SC/PR. Concorrência com desconto forte (Altenburg). Contexto: site Shopify recém-no-ar, showroom em São Paulo, datas comerciais fortes.</w:t>
             </w:r>
           </w:p>
         </w:tc>
@@ -6292,7 +6798,7 @@
         </w:tc>
       </w:tr>
     </w:tbl>
-    <w:bookmarkEnd w:id="53"/>
+    <w:bookmarkEnd w:id="54"/>
     <w:sectPr>
       <w:pgSz w:w="11906" w:h="16838"/>
       <w:pgMar w:left="1134" w:right="1134" w:top="1134" w:bottom="1134"/>
@@ -6615,6 +7121,9 @@
     <w:abstractNumId w:val="991"/>
   </w:num>
   <w:num w:numId="1017">
+    <w:abstractNumId w:val="991"/>
+  </w:num>
+  <w:num w:numId="1018">
     <w:abstractNumId w:val="99201"/>
     <w:lvlOverride w:ilvl="0">
       <w:startOverride w:val="1"/>
@@ -6644,7 +7153,7 @@
       <w:startOverride w:val="1"/>
     </w:lvlOverride>
   </w:num>
-  <w:num w:numId="1018">
+  <w:num w:numId="1019">
     <w:abstractNumId w:val="991"/>
   </w:num>
 </w:numbering>

</xml_diff>